<commit_message>
add new way handle formuls
</commit_message>
<xml_diff>
--- a/tst.docx
+++ b/tst.docx
@@ -342,175 +342,295 @@
         <w:t>но вот и все par updated</w:t>
       </w:r>
     </w:p>
-    <w:p>
-      <w:pPr>
-        <w:jc w:val="right"/>
-      </w:pPr>
-      <w:r>
-        <m:oMath>
-          <m:r>
-            <m:t>2+2=10</m:t>
-          </m:r>
-        </m:oMath>
-      </w:r>
-      <w:r>
-        <w:t>(1.1)</w:t>
-      </w:r>
-      <w:p>
-        <w:r>
-          <w:drawing>
-            <wp:inline xmlns:a="http://schemas.openxmlformats.org/drawingml/2006/main" xmlns:pic="http://schemas.openxmlformats.org/drawingml/2006/picture">
-              <wp:extent cx="1270000" cy="1270000"/>
-              <wp:docPr id="3" name="Picture 3"/>
-              <wp:cNvGraphicFramePr>
-                <a:graphicFrameLocks noChangeAspect="1"/>
-              </wp:cNvGraphicFramePr>
-              <a:graphic>
-                <a:graphicData uri="http://schemas.openxmlformats.org/drawingml/2006/picture">
-                  <pic:pic>
-                    <pic:nvPicPr>
-                      <pic:cNvPr id="0" name="image.png"/>
-                      <pic:cNvPicPr/>
-                    </pic:nvPicPr>
-                    <pic:blipFill>
-                      <a:blip r:embed="rId8"/>
-                      <a:stretch>
-                        <a:fillRect/>
-                      </a:stretch>
-                    </pic:blipFill>
-                    <pic:spPr>
-                      <a:xfrm>
-                        <a:off x="0" y="0"/>
-                        <a:ext cx="1270000" cy="1270000"/>
-                      </a:xfrm>
-                      <a:prstGeom prst="rect"/>
-                    </pic:spPr>
-                  </pic:pic>
-                </a:graphicData>
-              </a:graphic>
-            </wp:inline>
-          </w:drawing>
-        </w:r>
-      </w:p>
-      <w:p>
-        <w:r>
-          <w:t>Рисунок 1.3 – red one Новое изображение</w:t>
-        </w:r>
-      </w:p>
-      <w:p>
-        <w:pPr>
-          <w:jc w:val="right"/>
-        </w:pPr>
-        <w:r>
-          <m:oMath>
-            <m:sSup>
-              <m:e>
+    <w:tbl>
+      <w:tblPr>
+        <w:tblW w:type="auto" w:w="0"/>
+        <w:tblLook w:firstColumn="1" w:firstRow="1" w:lastColumn="0" w:lastRow="0" w:noHBand="0" w:noVBand="1" w:val="04A0"/>
+      </w:tblPr>
+      <w:tblGrid>
+        <w:gridCol w:w="3120"/>
+        <w:gridCol w:w="3120"/>
+        <w:gridCol w:w="3120"/>
+      </w:tblGrid>
+      <w:tr>
+        <w:tc>
+          <w:tcPr>
+            <w:tcW w:type="dxa" w:w="3120"/>
+          </w:tcPr>
+          <w:p>
+            <w:pPr>
+              <w:spacing w:after="0" w:before="0"/>
+            </w:pPr>
+          </w:p>
+        </w:tc>
+        <w:tc>
+          <w:tcPr>
+            <w:tcW w:type="dxa" w:w="3120"/>
+          </w:tcPr>
+          <w:p>
+            <w:pPr>
+              <w:spacing w:after="0" w:before="0"/>
+              <w:jc w:val="center"/>
+            </w:pPr>
+            <w:r>
+              <m:oMath>
                 <m:r>
-                  <m:t>E=233d2mc</m:t>
+                  <m:t>2+2=10</m:t>
                 </m:r>
-              </m:e>
-              <m:sup>
+              </m:oMath>
+            </w:r>
+          </w:p>
+        </w:tc>
+        <w:tc>
+          <w:tcPr>
+            <w:tcW w:type="dxa" w:w="3120"/>
+          </w:tcPr>
+          <w:p>
+            <w:pPr>
+              <w:spacing w:after="0" w:before="0"/>
+              <w:jc w:val="right"/>
+            </w:pPr>
+            <w:r>
+              <w:t>(1.1)</w:t>
+            </w:r>
+          </w:p>
+        </w:tc>
+      </w:tr>
+    </w:tbl>
+    <w:p>
+      <w:r>
+        <w:drawing>
+          <wp:inline xmlns:a="http://schemas.openxmlformats.org/drawingml/2006/main" xmlns:pic="http://schemas.openxmlformats.org/drawingml/2006/picture">
+            <wp:extent cx="1270000" cy="1270000"/>
+            <wp:docPr id="3" name="Picture 3"/>
+            <wp:cNvGraphicFramePr>
+              <a:graphicFrameLocks noChangeAspect="1"/>
+            </wp:cNvGraphicFramePr>
+            <a:graphic>
+              <a:graphicData uri="http://schemas.openxmlformats.org/drawingml/2006/picture">
+                <pic:pic>
+                  <pic:nvPicPr>
+                    <pic:cNvPr id="0" name="image.png"/>
+                    <pic:cNvPicPr/>
+                  </pic:nvPicPr>
+                  <pic:blipFill>
+                    <a:blip r:embed="rId8"/>
+                    <a:stretch>
+                      <a:fillRect/>
+                    </a:stretch>
+                  </pic:blipFill>
+                  <pic:spPr>
+                    <a:xfrm>
+                      <a:off x="0" y="0"/>
+                      <a:ext cx="1270000" cy="1270000"/>
+                    </a:xfrm>
+                    <a:prstGeom prst="rect"/>
+                  </pic:spPr>
+                </pic:pic>
+              </a:graphicData>
+            </a:graphic>
+          </wp:inline>
+        </w:drawing>
+      </w:r>
+    </w:p>
+    <w:p>
+      <w:r>
+        <w:t>Рисунок 1.3 – red one Новое изображение</w:t>
+      </w:r>
+    </w:p>
+    <w:tbl>
+      <w:tblPr>
+        <w:tblW w:type="auto" w:w="0"/>
+        <w:tblLook w:firstColumn="1" w:firstRow="1" w:lastColumn="0" w:lastRow="0" w:noHBand="0" w:noVBand="1" w:val="04A0"/>
+      </w:tblPr>
+      <w:tblGrid>
+        <w:gridCol w:w="3120"/>
+        <w:gridCol w:w="3120"/>
+        <w:gridCol w:w="3120"/>
+      </w:tblGrid>
+      <w:tr>
+        <w:tc>
+          <w:tcPr>
+            <w:tcW w:type="dxa" w:w="3120"/>
+          </w:tcPr>
+          <w:p>
+            <w:pPr>
+              <w:spacing w:after="0" w:before="0"/>
+            </w:pPr>
+          </w:p>
+        </w:tc>
+        <w:tc>
+          <w:tcPr>
+            <w:tcW w:type="dxa" w:w="3120"/>
+          </w:tcPr>
+          <w:p>
+            <w:pPr>
+              <w:spacing w:after="0" w:before="0"/>
+              <w:jc w:val="center"/>
+            </w:pPr>
+            <w:r>
+              <m:oMath>
+                <m:sSup>
+                  <m:e>
+                    <m:r>
+                      <m:t>E=233d2mc</m:t>
+                    </m:r>
+                  </m:e>
+                  <m:sup>
+                    <m:r>
+                      <m:t>2</m:t>
+                    </m:r>
+                  </m:sup>
+                </m:sSup>
+              </m:oMath>
+            </w:r>
+          </w:p>
+        </w:tc>
+        <w:tc>
+          <w:tcPr>
+            <w:tcW w:type="dxa" w:w="3120"/>
+          </w:tcPr>
+          <w:p>
+            <w:pPr>
+              <w:spacing w:after="0" w:before="0"/>
+              <w:jc w:val="right"/>
+            </w:pPr>
+            <w:r>
+              <w:t>(1.2)</w:t>
+            </w:r>
+          </w:p>
+        </w:tc>
+      </w:tr>
+    </w:tbl>
+    <w:p>
+      <w:pPr>
+        <w:pStyle w:val="3"/>
+      </w:pPr>
+      <w:r>
+        <w:t>1.3.1 toooto</w:t>
+      </w:r>
+    </w:p>
+    <w:p>
+      <w:r>
+        <w:t>dlasjd dk askdj lkasdно вот и все par updated</w:t>
+      </w:r>
+    </w:p>
+    <w:p>
+      <w:r>
+        <w:t>32131312412 412 4214но вот и все par updated</w:t>
+      </w:r>
+    </w:p>
+    <w:p>
+      <w:pPr>
+        <w:pStyle w:val="3"/>
+      </w:pPr>
+      <w:r>
+        <w:t>1.3.2 new_header105 che dks</w:t>
+      </w:r>
+    </w:p>
+    <w:p>
+      <w:r>
+        <w:t>new_header105; j1nj2eeio12e2m21eio dk askdj lkasdно вот и все par updated</w:t>
+      </w:r>
+    </w:p>
+    <w:p>
+      <w:r>
+        <w:t>new_header105 knodskd skds;kdaskdkasd 412 4214но вот и все par updated</w:t>
+      </w:r>
+    </w:p>
+    <w:p>
+      <w:pPr>
+        <w:pStyle w:val="3"/>
+      </w:pPr>
+      <w:r>
+        <w:t>1.3.3 che dks</w:t>
+      </w:r>
+    </w:p>
+    <w:p>
+      <w:r>
+        <w:t>dasindm; j1nj2eeio12e2m21eio dk askdj lkasdно вот и все par updated</w:t>
+      </w:r>
+    </w:p>
+    <w:p>
+      <w:r>
+        <w:t>IMage knodskd skds;kdaskdkasd 412 4214но вот и все par updated</w:t>
+      </w:r>
+    </w:p>
+    <w:p>
+      <w:pPr>
+        <w:pStyle w:val="2"/>
+      </w:pPr>
+      <w:r>
+        <w:t>1.4 d заголовок</w:t>
+      </w:r>
+    </w:p>
+    <w:p>
+      <w:r>
+        <w:t>321321321</w:t>
+      </w:r>
+    </w:p>
+    <w:tbl>
+      <w:tblPr>
+        <w:tblW w:type="auto" w:w="0"/>
+        <w:tblLook w:firstColumn="1" w:firstRow="1" w:lastColumn="0" w:lastRow="0" w:noHBand="0" w:noVBand="1" w:val="04A0"/>
+      </w:tblPr>
+      <w:tblGrid>
+        <w:gridCol w:w="3120"/>
+        <w:gridCol w:w="3120"/>
+        <w:gridCol w:w="3120"/>
+      </w:tblGrid>
+      <w:tr>
+        <w:tc>
+          <w:tcPr>
+            <w:tcW w:type="dxa" w:w="3120"/>
+          </w:tcPr>
+          <w:p>
+            <w:pPr>
+              <w:spacing w:after="0" w:before="0"/>
+            </w:pPr>
+          </w:p>
+        </w:tc>
+        <w:tc>
+          <w:tcPr>
+            <w:tcW w:type="dxa" w:w="3120"/>
+          </w:tcPr>
+          <w:p>
+            <w:pPr>
+              <w:spacing w:after="0" w:before="0"/>
+              <w:jc w:val="center"/>
+            </w:pPr>
+            <w:r>
+              <m:oMath>
                 <m:r>
-                  <m:t>2</m:t>
+                  <m:t>a-2=2</m:t>
                 </m:r>
-              </m:sup>
-            </m:sSup>
-          </m:oMath>
-        </w:r>
-        <w:r>
-          <w:t>(1.2)</w:t>
-        </w:r>
-        <w:p>
-          <w:pPr>
-            <w:pStyle w:val="3"/>
-          </w:pPr>
-          <w:r>
-            <w:t>1.3.1 toooto</w:t>
-          </w:r>
-        </w:p>
-        <w:p>
-          <w:r>
-            <w:t>dlasjd dk askdj lkasdно вот и все par updated</w:t>
-          </w:r>
-        </w:p>
-        <w:p>
-          <w:r>
-            <w:t>32131312412 412 4214но вот и все par updated</w:t>
-          </w:r>
-        </w:p>
-        <w:p>
-          <w:pPr>
-            <w:pStyle w:val="3"/>
-          </w:pPr>
-          <w:r>
-            <w:t>1.3.2 new_header105 che dks</w:t>
-          </w:r>
-        </w:p>
-        <w:p>
-          <w:r>
-            <w:t>new_header105; j1nj2eeio12e2m21eio dk askdj lkasdно вот и все par updated</w:t>
-          </w:r>
-        </w:p>
-        <w:p>
-          <w:r>
-            <w:t>new_header105 knodskd skds;kdaskdkasd 412 4214но вот и все par updated</w:t>
-          </w:r>
-        </w:p>
-        <w:p>
-          <w:pPr>
-            <w:pStyle w:val="3"/>
-          </w:pPr>
-          <w:r>
-            <w:t>1.3.3 che dks</w:t>
-          </w:r>
-        </w:p>
-        <w:p>
-          <w:r>
-            <w:t>dasindm; j1nj2eeio12e2m21eio dk askdj lkasdно вот и все par updated</w:t>
-          </w:r>
-        </w:p>
-        <w:p>
-          <w:r>
-            <w:t>IMage knodskd skds;kdaskdkasd 412 4214но вот и все par updated</w:t>
-          </w:r>
-        </w:p>
-      </w:p>
-    </w:p>
-    <w:p>
-      <w:pPr>
-        <w:pStyle w:val="2"/>
-      </w:pPr>
-      <w:r>
-        <w:t>1.4 d заголовок</w:t>
-      </w:r>
-    </w:p>
-    <w:p>
-      <w:r>
-        <w:t>321321321</w:t>
-      </w:r>
-    </w:p>
-    <w:p>
-      <w:pPr>
-        <w:jc w:val="right"/>
-      </w:pPr>
-      <w:r>
-        <m:oMath>
-          <m:r>
-            <m:t>a-2=2</m:t>
-          </m:r>
-        </m:oMath>
-      </w:r>
-      <w:r>
-        <w:t>(1.3)</w:t>
-      </w:r>
-      <w:p>
-        <w:pPr>
-          <w:pStyle w:val="1"/>
-        </w:pPr>
-        <w:r>
-          <w:t>2 проверка го гого</w:t>
-        </w:r>
-      </w:p>
+              </m:oMath>
+            </w:r>
+          </w:p>
+        </w:tc>
+        <w:tc>
+          <w:tcPr>
+            <w:tcW w:type="dxa" w:w="3120"/>
+          </w:tcPr>
+          <w:p>
+            <w:pPr>
+              <w:spacing w:after="0" w:before="0"/>
+              <w:jc w:val="right"/>
+            </w:pPr>
+            <w:r>
+              <w:t>(1.3)</w:t>
+            </w:r>
+          </w:p>
+        </w:tc>
+      </w:tr>
+    </w:tbl>
+    <w:p>
+      <w:pPr>
+        <w:pStyle w:val="1"/>
+      </w:pPr>
+      <w:r>
+        <w:t>2 проверка го гого</w:t>
+      </w:r>
     </w:p>
     <w:p>
       <w:pPr>
@@ -536,6 +656,677 @@
     <w:p>
       <w:r>
         <w:t>Листинг 3.1 – capton new one</w:t>
+      </w:r>
+    </w:p>
+    <w:p>
+      <w:r>
+        <w:t>– dsadasd</w:t>
+      </w:r>
+    </w:p>
+    <w:p>
+      <w:r>
+        <w:t>– как-то так;</w:t>
+      </w:r>
+    </w:p>
+    <w:p>
+      <w:r>
+        <w:t>– пися231;</w:t>
+      </w:r>
+    </w:p>
+    <w:p>
+      <w:r>
+        <w:t>– ага.</w:t>
+      </w:r>
+    </w:p>
+    <w:p>
+      <w:pPr>
+        <w:pStyle w:val="1"/>
+      </w:pPr>
+      <w:r>
+        <w:t>4 Новый заголовок</w:t>
+      </w:r>
+    </w:p>
+    <w:p>
+      <w:r>
+        <w:drawing>
+          <wp:inline xmlns:a="http://schemas.openxmlformats.org/drawingml/2006/main" xmlns:pic="http://schemas.openxmlformats.org/drawingml/2006/picture">
+            <wp:extent cx="1270000" cy="1270000"/>
+            <wp:docPr id="5" name="Picture 5"/>
+            <wp:cNvGraphicFramePr>
+              <a:graphicFrameLocks noChangeAspect="1"/>
+            </wp:cNvGraphicFramePr>
+            <a:graphic>
+              <a:graphicData uri="http://schemas.openxmlformats.org/drawingml/2006/picture">
+                <pic:pic>
+                  <pic:nvPicPr>
+                    <pic:cNvPr id="0" name="image.png"/>
+                    <pic:cNvPicPr/>
+                  </pic:nvPicPr>
+                  <pic:blipFill>
+                    <a:blip r:embed="rId7"/>
+                    <a:stretch>
+                      <a:fillRect/>
+                    </a:stretch>
+                  </pic:blipFill>
+                  <pic:spPr>
+                    <a:xfrm>
+                      <a:off x="0" y="0"/>
+                      <a:ext cx="1270000" cy="1270000"/>
+                    </a:xfrm>
+                    <a:prstGeom prst="rect"/>
+                  </pic:spPr>
+                </pic:pic>
+              </a:graphicData>
+            </a:graphic>
+          </wp:inline>
+        </w:drawing>
+      </w:r>
+    </w:p>
+    <w:p>
+      <w:r>
+        <w:t>Рисунок 4.1 – Новdsdasdое изображение</w:t>
+      </w:r>
+    </w:p>
+    <w:p>
+      <w:r>
+        <w:drawing>
+          <wp:inline xmlns:a="http://schemas.openxmlformats.org/drawingml/2006/main" xmlns:pic="http://schemas.openxmlformats.org/drawingml/2006/picture">
+            <wp:extent cx="1270000" cy="1270000"/>
+            <wp:docPr id="4" name="Picture 4"/>
+            <wp:cNvGraphicFramePr>
+              <a:graphicFrameLocks noChangeAspect="1"/>
+            </wp:cNvGraphicFramePr>
+            <a:graphic>
+              <a:graphicData uri="http://schemas.openxmlformats.org/drawingml/2006/picture">
+                <pic:pic>
+                  <pic:nvPicPr>
+                    <pic:cNvPr id="0" name="image.png"/>
+                    <pic:cNvPicPr/>
+                  </pic:nvPicPr>
+                  <pic:blipFill>
+                    <a:blip r:embed="rId7"/>
+                    <a:stretch>
+                      <a:fillRect/>
+                    </a:stretch>
+                  </pic:blipFill>
+                  <pic:spPr>
+                    <a:xfrm>
+                      <a:off x="0" y="0"/>
+                      <a:ext cx="1270000" cy="1270000"/>
+                    </a:xfrm>
+                    <a:prstGeom prst="rect"/>
+                  </pic:spPr>
+                </pic:pic>
+              </a:graphicData>
+            </a:graphic>
+          </wp:inline>
+        </w:drawing>
+      </w:r>
+    </w:p>
+    <w:p>
+      <w:r>
+        <w:t>Рисунок 4.2 – Новое изображение</w:t>
+      </w:r>
+    </w:p>
+    <w:p>
+      <w:r>
+        <w:t>dasda32132131231sd</w:t>
+      </w:r>
+    </w:p>
+    <w:p>
+      <w:r>
+        <w:t>dasdasd</w:t>
+      </w:r>
+    </w:p>
+    <w:p>
+      <w:pPr>
+        <w:pStyle w:val="2"/>
+      </w:pPr>
+      <w:r>
+        <w:t>4.1 Новый222 заголовок</w:t>
+      </w:r>
+    </w:p>
+    <w:p>
+      <w:r>
+        <w:t>2020220</w:t>
+      </w:r>
+    </w:p>
+    <w:p>
+      <w:r>
+        <w:t>2020220323232</w:t>
+      </w:r>
+    </w:p>
+    <w:p>
+      <w:pPr>
+        <w:pStyle w:val="3"/>
+      </w:pPr>
+      <w:r>
+        <w:t>4.1.1 ну я хитрееее тебя 333проверка го гого</w:t>
+      </w:r>
+    </w:p>
+    <w:p>
+      <w:r>
+        <w:t>[bnh эомент]</w:t>
+      </w:r>
+    </w:p>
+    <w:p>
+      <w:pPr>
+        <w:pStyle w:val="2"/>
+      </w:pPr>
+      <w:r>
+        <w:t>4.2 Ну если и это заголоовк мошны йто просто молчу</w:t>
+      </w:r>
+    </w:p>
+    <w:p>
+      <w:r>
+        <w:t>pusin</w:t>
+      </w:r>
+    </w:p>
+    <w:p>
+      <w:r>
+        <w:t>pusin3</w:t>
+      </w:r>
+    </w:p>
+    <w:p>
+      <w:r>
+        <w:t>pusin2</w:t>
+      </w:r>
+    </w:p>
+    <w:p>
+      <w:pPr>
+        <w:pStyle w:val="2"/>
+      </w:pPr>
+      <w:r>
+        <w:t>4.3 иди сюда заголовок 2</w:t>
+      </w:r>
+    </w:p>
+    <w:p>
+      <w:r>
+        <w:t>Таблица 4.1 – Fracat32ion table</w:t>
+      </w:r>
+    </w:p>
+    <w:tbl>
+      <w:tblPr>
+        <w:tblW w:type="auto" w:w="0"/>
+        <w:tblLook w:firstColumn="1" w:firstRow="1" w:lastColumn="0" w:lastRow="0" w:noHBand="0" w:noVBand="1" w:val="04A0"/>
+      </w:tblPr>
+      <w:tblGrid>
+        <w:gridCol w:w="4680"/>
+        <w:gridCol w:w="4680"/>
+      </w:tblGrid>
+      <w:tr>
+        <w:tc>
+          <w:tcPr>
+            <w:tcW w:type="dxa" w:w="4680"/>
+          </w:tcPr>
+          <w:p>
+            <w:r>
+              <w:t>10</w:t>
+            </w:r>
+          </w:p>
+        </w:tc>
+        <w:tc>
+          <w:tcPr>
+            <w:tcW w:type="dxa" w:w="4680"/>
+          </w:tcPr>
+          <w:p>
+            <w:r>
+              <w:t>10</w:t>
+            </w:r>
+          </w:p>
+        </w:tc>
+      </w:tr>
+      <w:tr>
+        <w:tc>
+          <w:tcPr>
+            <w:tcW w:type="dxa" w:w="4680"/>
+          </w:tcPr>
+          <w:p>
+            <w:r>
+              <w:t>20</w:t>
+            </w:r>
+          </w:p>
+        </w:tc>
+        <w:tc>
+          <w:tcPr>
+            <w:tcW w:type="dxa" w:w="4680"/>
+          </w:tcPr>
+          <w:p>
+            <w:r>
+              <w:t>20</w:t>
+            </w:r>
+          </w:p>
+        </w:tc>
+      </w:tr>
+    </w:tbl>
+    <w:p>
+      <w:r>
+        <w:t>susapusin3</w:t>
+      </w:r>
+    </w:p>
+    <w:p>
+      <w:r>
+        <w:t>Таблица 4.2 – Fracation table</w:t>
+      </w:r>
+    </w:p>
+    <w:tbl>
+      <w:tblPr>
+        <w:tblW w:type="auto" w:w="0"/>
+        <w:tblLook w:firstColumn="1" w:firstRow="1" w:lastColumn="0" w:lastRow="0" w:noHBand="0" w:noVBand="1" w:val="04A0"/>
+      </w:tblPr>
+      <w:tblGrid>
+        <w:gridCol w:w="4680"/>
+        <w:gridCol w:w="4680"/>
+      </w:tblGrid>
+      <w:tr>
+        <w:tc>
+          <w:tcPr>
+            <w:tcW w:type="dxa" w:w="4680"/>
+          </w:tcPr>
+          <w:p>
+            <w:r>
+              <w:t>1</w:t>
+            </w:r>
+          </w:p>
+        </w:tc>
+        <w:tc>
+          <w:tcPr>
+            <w:tcW w:type="dxa" w:w="4680"/>
+          </w:tcPr>
+          <w:p>
+            <w:r>
+              <w:t>1</w:t>
+            </w:r>
+          </w:p>
+        </w:tc>
+      </w:tr>
+      <w:tr>
+        <w:tc>
+          <w:tcPr>
+            <w:tcW w:type="dxa" w:w="4680"/>
+          </w:tcPr>
+          <w:p>
+            <w:r>
+              <w:t>2</w:t>
+            </w:r>
+          </w:p>
+        </w:tc>
+        <w:tc>
+          <w:tcPr>
+            <w:tcW w:type="dxa" w:w="4680"/>
+          </w:tcPr>
+          <w:p>
+            <w:r>
+              <w:t>2</w:t>
+            </w:r>
+          </w:p>
+        </w:tc>
+      </w:tr>
+      <w:tr>
+        <w:tc>
+          <w:tcPr>
+            <w:tcW w:type="dxa" w:w="4680"/>
+          </w:tcPr>
+          <w:p>
+            <w:r>
+              <w:t>3</w:t>
+            </w:r>
+          </w:p>
+        </w:tc>
+        <w:tc>
+          <w:tcPr>
+            <w:tcW w:type="dxa" w:w="4680"/>
+          </w:tcPr>
+          <w:p>
+            <w:r>
+              <w:t>3</w:t>
+            </w:r>
+          </w:p>
+        </w:tc>
+      </w:tr>
+    </w:tbl>
+    <w:p>
+      <w:pPr>
+        <w:pBdr>
+          <w:top w:val="single" w:sz="4" w:space="4" w:color="000000"/>
+          <w:left w:val="single" w:sz="4" w:space="4" w:color="000000"/>
+          <w:bottom w:val="single" w:sz="4" w:space="4" w:color="000000"/>
+          <w:right w:val="single" w:sz="4" w:space="4" w:color="000000"/>
+        </w:pBdr>
+      </w:pPr>
+      <w:r>
+        <w:t>3213123 1321poso smskdmska dmsn dkasjndjkasjdnasjkdnjaksdnajnaskdjnasjkdn kdsna ksdnas poso smskdmska dmsn dkasjndjkasjdnasjkdnjaksdnajnaskdjnasjkdn kdsna ksdnas poso smskdmska dmsn dkasjndjkasjdnasjkdnjaksdnajnaskdjnasjkdn kdsna ksdnas poso smskdmska dmsn dkasjndjkasjdnasjkdnjaksdnajnaskdjnasjkdn kdsna ksdnasposo smskdmska dmsn dkasjndjkasjdnasjkdnjaksdnajnaskdjnasjkdn kdsna ksdnas</w:t>
+      </w:r>
+    </w:p>
+    <w:p>
+      <w:r>
+        <w:t>Листинг 4.1 – 32capton new one</w:t>
+      </w:r>
+    </w:p>
+    <w:p>
+      <w:r>
+        <w:t>after table?</w:t>
+      </w:r>
+    </w:p>
+    <w:p>
+      <w:r>
+        <w:t>но вот и все par updated</w:t>
+      </w:r>
+    </w:p>
+    <w:tbl>
+      <w:tblPr>
+        <w:tblW w:type="auto" w:w="0"/>
+        <w:tblLook w:firstColumn="1" w:firstRow="1" w:lastColumn="0" w:lastRow="0" w:noHBand="0" w:noVBand="1" w:val="04A0"/>
+      </w:tblPr>
+      <w:tblGrid>
+        <w:gridCol w:w="3120"/>
+        <w:gridCol w:w="3120"/>
+        <w:gridCol w:w="3120"/>
+      </w:tblGrid>
+      <w:tr>
+        <w:tc>
+          <w:tcPr>
+            <w:tcW w:type="dxa" w:w="3120"/>
+          </w:tcPr>
+          <w:p>
+            <w:pPr>
+              <w:spacing w:after="0" w:before="0"/>
+            </w:pPr>
+          </w:p>
+        </w:tc>
+        <w:tc>
+          <w:tcPr>
+            <w:tcW w:type="dxa" w:w="3120"/>
+          </w:tcPr>
+          <w:p>
+            <w:pPr>
+              <w:spacing w:after="0" w:before="0"/>
+              <w:jc w:val="center"/>
+            </w:pPr>
+            <w:r>
+              <m:oMath>
+                <m:r>
+                  <m:t>2+2=10</m:t>
+                </m:r>
+              </m:oMath>
+            </w:r>
+          </w:p>
+        </w:tc>
+        <w:tc>
+          <w:tcPr>
+            <w:tcW w:type="dxa" w:w="3120"/>
+          </w:tcPr>
+          <w:p>
+            <w:pPr>
+              <w:spacing w:after="0" w:before="0"/>
+              <w:jc w:val="right"/>
+            </w:pPr>
+            <w:r>
+              <w:t>(4.1)</w:t>
+            </w:r>
+          </w:p>
+        </w:tc>
+      </w:tr>
+    </w:tbl>
+    <w:p>
+      <w:r>
+        <w:drawing>
+          <wp:inline xmlns:a="http://schemas.openxmlformats.org/drawingml/2006/main" xmlns:pic="http://schemas.openxmlformats.org/drawingml/2006/picture">
+            <wp:extent cx="1270000" cy="1270000"/>
+            <wp:docPr id="6" name="Picture 6"/>
+            <wp:cNvGraphicFramePr>
+              <a:graphicFrameLocks noChangeAspect="1"/>
+            </wp:cNvGraphicFramePr>
+            <a:graphic>
+              <a:graphicData uri="http://schemas.openxmlformats.org/drawingml/2006/picture">
+                <pic:pic>
+                  <pic:nvPicPr>
+                    <pic:cNvPr id="0" name="image.png"/>
+                    <pic:cNvPicPr/>
+                  </pic:nvPicPr>
+                  <pic:blipFill>
+                    <a:blip r:embed="rId8"/>
+                    <a:stretch>
+                      <a:fillRect/>
+                    </a:stretch>
+                  </pic:blipFill>
+                  <pic:spPr>
+                    <a:xfrm>
+                      <a:off x="0" y="0"/>
+                      <a:ext cx="1270000" cy="1270000"/>
+                    </a:xfrm>
+                    <a:prstGeom prst="rect"/>
+                  </pic:spPr>
+                </pic:pic>
+              </a:graphicData>
+            </a:graphic>
+          </wp:inline>
+        </w:drawing>
+      </w:r>
+    </w:p>
+    <w:p>
+      <w:r>
+        <w:t>Рисунок 4.3 – red one Новое изображение</w:t>
+      </w:r>
+    </w:p>
+    <w:tbl>
+      <w:tblPr>
+        <w:tblW w:type="auto" w:w="0"/>
+        <w:tblLook w:firstColumn="1" w:firstRow="1" w:lastColumn="0" w:lastRow="0" w:noHBand="0" w:noVBand="1" w:val="04A0"/>
+      </w:tblPr>
+      <w:tblGrid>
+        <w:gridCol w:w="3120"/>
+        <w:gridCol w:w="3120"/>
+        <w:gridCol w:w="3120"/>
+      </w:tblGrid>
+      <w:tr>
+        <w:tc>
+          <w:tcPr>
+            <w:tcW w:type="dxa" w:w="3120"/>
+          </w:tcPr>
+          <w:p>
+            <w:pPr>
+              <w:spacing w:after="0" w:before="0"/>
+            </w:pPr>
+          </w:p>
+        </w:tc>
+        <w:tc>
+          <w:tcPr>
+            <w:tcW w:type="dxa" w:w="3120"/>
+          </w:tcPr>
+          <w:p>
+            <w:pPr>
+              <w:spacing w:after="0" w:before="0"/>
+              <w:jc w:val="center"/>
+            </w:pPr>
+            <w:r>
+              <m:oMath>
+                <m:sSup>
+                  <m:e>
+                    <m:r>
+                      <m:t>E=233d2mc</m:t>
+                    </m:r>
+                  </m:e>
+                  <m:sup>
+                    <m:r>
+                      <m:t>2</m:t>
+                    </m:r>
+                  </m:sup>
+                </m:sSup>
+              </m:oMath>
+            </w:r>
+          </w:p>
+        </w:tc>
+        <w:tc>
+          <w:tcPr>
+            <w:tcW w:type="dxa" w:w="3120"/>
+          </w:tcPr>
+          <w:p>
+            <w:pPr>
+              <w:spacing w:after="0" w:before="0"/>
+              <w:jc w:val="right"/>
+            </w:pPr>
+            <w:r>
+              <w:t>(4.2)</w:t>
+            </w:r>
+          </w:p>
+        </w:tc>
+      </w:tr>
+    </w:tbl>
+    <w:p>
+      <w:pPr>
+        <w:pStyle w:val="3"/>
+      </w:pPr>
+      <w:r>
+        <w:t>4.3.1 toooto</w:t>
+      </w:r>
+    </w:p>
+    <w:p>
+      <w:r>
+        <w:t>dlasjd dk askdj lkasdно вот и все par updated</w:t>
+      </w:r>
+    </w:p>
+    <w:p>
+      <w:r>
+        <w:t>32131312412 412 4214но вот и все par updated</w:t>
+      </w:r>
+    </w:p>
+    <w:p>
+      <w:pPr>
+        <w:pStyle w:val="3"/>
+      </w:pPr>
+      <w:r>
+        <w:t>4.3.2 new_header105 che dks</w:t>
+      </w:r>
+    </w:p>
+    <w:p>
+      <w:r>
+        <w:t>new_header105; j1nj2eeio12e2m21eio dk askdj lkasdно вот и все par updated</w:t>
+      </w:r>
+    </w:p>
+    <w:p>
+      <w:r>
+        <w:t>new_header105 knodskd skds;kdaskdkasd 412 4214но вот и все par updated</w:t>
+      </w:r>
+    </w:p>
+    <w:p>
+      <w:pPr>
+        <w:pStyle w:val="3"/>
+      </w:pPr>
+      <w:r>
+        <w:t>4.3.3 che dks</w:t>
+      </w:r>
+    </w:p>
+    <w:p>
+      <w:r>
+        <w:t>dasindm; j1nj2eeio12e2m21eio dk askdj lkasdно вот и все par updated</w:t>
+      </w:r>
+    </w:p>
+    <w:p>
+      <w:r>
+        <w:t>IMage knodskd skds;kdaskdkasd 412 4214но вот и все par updated</w:t>
+      </w:r>
+    </w:p>
+    <w:p>
+      <w:pPr>
+        <w:pStyle w:val="2"/>
+      </w:pPr>
+      <w:r>
+        <w:t>4.4 d заголовок</w:t>
+      </w:r>
+    </w:p>
+    <w:p>
+      <w:r>
+        <w:t>321321321</w:t>
+      </w:r>
+    </w:p>
+    <w:tbl>
+      <w:tblPr>
+        <w:tblW w:type="auto" w:w="0"/>
+        <w:tblLook w:firstColumn="1" w:firstRow="1" w:lastColumn="0" w:lastRow="0" w:noHBand="0" w:noVBand="1" w:val="04A0"/>
+      </w:tblPr>
+      <w:tblGrid>
+        <w:gridCol w:w="3120"/>
+        <w:gridCol w:w="3120"/>
+        <w:gridCol w:w="3120"/>
+      </w:tblGrid>
+      <w:tr>
+        <w:tc>
+          <w:tcPr>
+            <w:tcW w:type="dxa" w:w="3120"/>
+          </w:tcPr>
+          <w:p>
+            <w:pPr>
+              <w:spacing w:after="0" w:before="0"/>
+            </w:pPr>
+          </w:p>
+        </w:tc>
+        <w:tc>
+          <w:tcPr>
+            <w:tcW w:type="dxa" w:w="3120"/>
+          </w:tcPr>
+          <w:p>
+            <w:pPr>
+              <w:spacing w:after="0" w:before="0"/>
+              <w:jc w:val="center"/>
+            </w:pPr>
+            <w:r>
+              <m:oMath>
+                <m:r>
+                  <m:t>a-2=2</m:t>
+                </m:r>
+              </m:oMath>
+            </w:r>
+          </w:p>
+        </w:tc>
+        <w:tc>
+          <w:tcPr>
+            <w:tcW w:type="dxa" w:w="3120"/>
+          </w:tcPr>
+          <w:p>
+            <w:pPr>
+              <w:spacing w:after="0" w:before="0"/>
+              <w:jc w:val="right"/>
+            </w:pPr>
+            <w:r>
+              <w:t>(4.3)</w:t>
+            </w:r>
+          </w:p>
+        </w:tc>
+      </w:tr>
+    </w:tbl>
+    <w:p>
+      <w:pPr>
+        <w:pStyle w:val="1"/>
+      </w:pPr>
+      <w:r>
+        <w:t>5 проверка го гого</w:t>
+      </w:r>
+    </w:p>
+    <w:p>
+      <w:pPr>
+        <w:pStyle w:val="1"/>
+      </w:pPr>
+      <w:r>
+        <w:t>6 иди сюда заголовок</w:t>
+      </w:r>
+    </w:p>
+    <w:p>
+      <w:pPr>
+        <w:pBdr>
+          <w:top w:val="single" w:sz="4" w:space="4" w:color="000000"/>
+          <w:left w:val="single" w:sz="4" w:space="4" w:color="000000"/>
+          <w:bottom w:val="single" w:sz="4" w:space="4" w:color="000000"/>
+          <w:right w:val="single" w:sz="4" w:space="4" w:color="000000"/>
+        </w:pBdr>
+      </w:pPr>
+      <w:r>
+        <w:t>poso smskdmska dmsn dkasjndjkasjdnasjkdnjaksdnajnaskdjnasjkdn kdsna ksdnas</w:t>
+      </w:r>
+    </w:p>
+    <w:p>
+      <w:r>
+        <w:t>Листинг 6.1 – capton new one</w:t>
       </w:r>
     </w:p>
     <w:p>

</xml_diff>

<commit_message>
fix formual temp, problem with isze and fami;y font
</commit_message>
<xml_diff>
--- a/tst.docx
+++ b/tst.docx
@@ -3,6 +3,13 @@
 <w:document xmlns:wpc="http://schemas.microsoft.com/office/word/2010/wordprocessingCanvas" xmlns:cx="http://schemas.microsoft.com/office/drawing/2014/chartex" xmlns:cx1="http://schemas.microsoft.com/office/drawing/2015/9/8/chartex" xmlns:cx2="http://schemas.microsoft.com/office/drawing/2015/10/21/chartex" xmlns:cx3="http://schemas.microsoft.com/office/drawing/2016/5/9/chartex" xmlns:cx4="http://schemas.microsoft.com/office/drawing/2016/5/10/chartex" xmlns:cx5="http://schemas.microsoft.com/office/drawing/2016/5/11/chartex" xmlns:cx6="http://schemas.microsoft.com/office/drawing/2016/5/12/chartex" xmlns:cx7="http://schemas.microsoft.com/office/drawing/2016/5/13/chartex" xmlns:cx8="http://schemas.microsoft.com/office/drawing/2016/5/14/chartex" xmlns:mc="http://schemas.openxmlformats.org/markup-compatibility/2006" xmlns:aink="http://schemas.microsoft.com/office/drawing/2016/ink" xmlns:am3d="http://schemas.microsoft.com/office/drawing/2017/model3d" xmlns:o="urn:schemas-microsoft-com:office:office" xmlns:r="http://schemas.openxmlformats.org/officeDocument/2006/relationships" xmlns:m="http://schemas.openxmlformats.org/officeDocument/2006/math" xmlns:v="urn:schemas-microsoft-com:vml" xmlns:wp14="http://schemas.microsoft.com/office/word/2010/wordprocessingDrawing" xmlns:wp="http://schemas.openxmlformats.org/drawingml/2006/wordprocessingDrawing" xmlns:w10="urn:schemas-microsoft-com:office:word" xmlns:w="http://schemas.openxmlformats.org/wordprocessingml/2006/main" xmlns:w14="http://schemas.microsoft.com/office/word/2010/wordml" xmlns:w15="http://schemas.microsoft.com/office/word/2012/wordml" xmlns:w16cex="http://schemas.microsoft.com/office/word/2018/wordml/cex" xmlns:w16cid="http://schemas.microsoft.com/office/word/2016/wordml/cid" xmlns:w16="http://schemas.microsoft.com/office/word/2018/wordml" xmlns:w16sdtdh="http://schemas.microsoft.com/office/word/2020/wordml/sdtdatahash" xmlns:w16se="http://schemas.microsoft.com/office/word/2015/wordml/symex" xmlns:wpg="http://schemas.microsoft.com/office/word/2010/wordprocessingGroup" xmlns:wpi="http://schemas.microsoft.com/office/word/2010/wordprocessingInk" xmlns:wne="http://schemas.microsoft.com/office/word/2006/wordml" xmlns:wps="http://schemas.microsoft.com/office/word/2010/wordprocessingShape" mc:Ignorable="w14 w15 w16se w16cid w16 w16cex w16sdtdh wp14">
   <w:body>
     <w:p>
+      <w:pPr>
+        <w:spacing w:after="0" w:line="240" w:lineRule="auto"/>
+        <w:ind w:firstLine="709"/>
+        <w:rPr>
+          <w:lang w:val="ru-RU"/>
+        </w:rPr>
+      </w:pPr>
       <w:r>
         <w:t>d</w:t>
       </w:r>
@@ -769,6 +776,74 @@
       </w:tblBorders>
     </w:tblPr>
   </w:style>
+  <w:style w:type="character" w:styleId="a5">
+    <w:name w:val="annotation reference"/>
+    <w:basedOn w:val="a0"/>
+    <w:uiPriority w:val="99"/>
+    <w:semiHidden/>
+    <w:unhideWhenUsed/>
+    <w:rsid w:val="00263833"/>
+    <w:rPr>
+      <w:sz w:val="16"/>
+      <w:szCs w:val="16"/>
+    </w:rPr>
+  </w:style>
+  <w:style w:type="paragraph" w:styleId="a6">
+    <w:name w:val="annotation text"/>
+    <w:basedOn w:val="a"/>
+    <w:link w:val="a7"/>
+    <w:uiPriority w:val="99"/>
+    <w:semiHidden/>
+    <w:unhideWhenUsed/>
+    <w:rsid w:val="00263833"/>
+    <w:pPr>
+      <w:spacing w:line="240" w:lineRule="auto"/>
+    </w:pPr>
+    <w:rPr>
+      <w:sz w:val="20"/>
+      <w:szCs w:val="20"/>
+    </w:rPr>
+  </w:style>
+  <w:style w:type="character" w:customStyle="1" w:styleId="a7">
+    <w:name w:val="Текст примечания Знак"/>
+    <w:basedOn w:val="a0"/>
+    <w:link w:val="a6"/>
+    <w:uiPriority w:val="99"/>
+    <w:semiHidden/>
+    <w:rsid w:val="00263833"/>
+    <w:rPr>
+      <w:sz w:val="20"/>
+      <w:szCs w:val="20"/>
+    </w:rPr>
+  </w:style>
+  <w:style w:type="paragraph" w:styleId="a8">
+    <w:name w:val="annotation subject"/>
+    <w:basedOn w:val="a6"/>
+    <w:next w:val="a6"/>
+    <w:link w:val="a9"/>
+    <w:uiPriority w:val="99"/>
+    <w:semiHidden/>
+    <w:unhideWhenUsed/>
+    <w:rsid w:val="00263833"/>
+    <w:rPr>
+      <w:b/>
+      <w:bCs/>
+    </w:rPr>
+  </w:style>
+  <w:style w:type="character" w:customStyle="1" w:styleId="a9">
+    <w:name w:val="Тема примечания Знак"/>
+    <w:basedOn w:val="a7"/>
+    <w:link w:val="a8"/>
+    <w:uiPriority w:val="99"/>
+    <w:semiHidden/>
+    <w:rsid w:val="00263833"/>
+    <w:rPr>
+      <w:b/>
+      <w:bCs/>
+      <w:sz w:val="20"/>
+      <w:szCs w:val="20"/>
+    </w:rPr>
+  </w:style>
 </w:styles>
 </file>
 

</xml_diff>

<commit_message>
can parse and print comple table
</commit_message>
<xml_diff>
--- a/tst.docx
+++ b/tst.docx
@@ -2,75 +2,80 @@
 <file path=word/document.xml><?xml version="1.0" encoding="utf-8"?>
 <w:document xmlns:wpc="http://schemas.microsoft.com/office/word/2010/wordprocessingCanvas" xmlns:cx="http://schemas.microsoft.com/office/drawing/2014/chartex" xmlns:cx1="http://schemas.microsoft.com/office/drawing/2015/9/8/chartex" xmlns:cx2="http://schemas.microsoft.com/office/drawing/2015/10/21/chartex" xmlns:cx3="http://schemas.microsoft.com/office/drawing/2016/5/9/chartex" xmlns:cx4="http://schemas.microsoft.com/office/drawing/2016/5/10/chartex" xmlns:cx5="http://schemas.microsoft.com/office/drawing/2016/5/11/chartex" xmlns:cx6="http://schemas.microsoft.com/office/drawing/2016/5/12/chartex" xmlns:cx7="http://schemas.microsoft.com/office/drawing/2016/5/13/chartex" xmlns:cx8="http://schemas.microsoft.com/office/drawing/2016/5/14/chartex" xmlns:mc="http://schemas.openxmlformats.org/markup-compatibility/2006" xmlns:aink="http://schemas.microsoft.com/office/drawing/2016/ink" xmlns:am3d="http://schemas.microsoft.com/office/drawing/2017/model3d" xmlns:o="urn:schemas-microsoft-com:office:office" xmlns:r="http://schemas.openxmlformats.org/officeDocument/2006/relationships" xmlns:m="http://schemas.openxmlformats.org/officeDocument/2006/math" xmlns:v="urn:schemas-microsoft-com:vml" xmlns:wp14="http://schemas.microsoft.com/office/word/2010/wordprocessingDrawing" xmlns:wp="http://schemas.openxmlformats.org/drawingml/2006/wordprocessingDrawing" xmlns:w10="urn:schemas-microsoft-com:office:word" xmlns:w="http://schemas.openxmlformats.org/wordprocessingml/2006/main" xmlns:w14="http://schemas.microsoft.com/office/word/2010/wordml" xmlns:w15="http://schemas.microsoft.com/office/word/2012/wordml" xmlns:w16cex="http://schemas.microsoft.com/office/word/2018/wordml/cex" xmlns:w16cid="http://schemas.microsoft.com/office/word/2016/wordml/cid" xmlns:w16="http://schemas.microsoft.com/office/word/2018/wordml" xmlns:w16sdtdh="http://schemas.microsoft.com/office/word/2020/wordml/sdtdatahash" xmlns:w16se="http://schemas.microsoft.com/office/word/2015/wordml/symex" xmlns:wpg="http://schemas.microsoft.com/office/word/2010/wordprocessingGroup" xmlns:wpi="http://schemas.microsoft.com/office/word/2010/wordprocessingInk" xmlns:wne="http://schemas.microsoft.com/office/word/2006/wordml" xmlns:wps="http://schemas.microsoft.com/office/word/2010/wordprocessingShape" mc:Ignorable="w14 w15 w16se w16cid w16 w16cex w16sdtdh wp14">
   <w:body>
-    <w:p/>
     <w:p>
       <w:pPr>
         <w:pStyle w:val="1"/>
         <w:pageBreakBefore/>
-        <w:spacing w:line="240" w:lineRule="auto" w:before="0" w:after="360"/>
-        <w:ind w:left="0" w:right="0" w:firstLine="709"/>
+        <w:spacing w:before="0" w:after="360" w:line="240" w:lineRule="auto"/>
+        <w:ind w:firstLine="709"/>
+        <w:rPr>
+          <w:lang w:val="ru-RU"/>
+        </w:rPr>
       </w:pPr>
       <w:r>
         <w:rPr>
           <w:rFonts w:ascii="Times New Roman" w:hAnsi="Times New Roman"/>
           <w:b/>
-          <w:i w:val="0"/>
-          <w:color w:val="000000"/>
-          <w:sz w:val="28"/>
-        </w:rPr>
-        <w:t>1 Новый заголовок</w:t>
-      </w:r>
-    </w:p>
-    <w:p>
-      <w:pPr>
-        <w:spacing w:line="240" w:lineRule="auto" w:before="280" w:after="0"/>
-        <w:ind w:left="0" w:right="0" w:firstLine="0"/>
-        <w:jc w:val="left"/>
-      </w:pPr>
-      <w:r>
-        <w:rPr>
-          <w:rFonts w:ascii="Times New Roman" w:hAnsi="Times New Roman"/>
-          <w:i w:val="0"/>
-          <w:color w:val="000000"/>
-          <w:sz w:val="28"/>
-        </w:rPr>
-        <w:t>Таблица 1.1 – Fracation table</w:t>
+          <w:color w:val="000000"/>
+          <w:sz w:val="28"/>
+          <w:lang w:val="ru-RU"/>
+        </w:rPr>
+        <w:t>1 Ну он гей</w:t>
+      </w:r>
+    </w:p>
+    <w:p>
+      <w:pPr>
+        <w:spacing w:before="280" w:after="0" w:line="240" w:lineRule="auto"/>
+        <w:rPr>
+          <w:lang w:val="ru-RU"/>
+        </w:rPr>
+      </w:pPr>
+      <w:r>
+        <w:rPr>
+          <w:rFonts w:ascii="Times New Roman" w:hAnsi="Times New Roman"/>
+          <w:color w:val="000000"/>
+          <w:sz w:val="28"/>
+          <w:lang w:val="ru-RU"/>
+        </w:rPr>
+        <w:t>Таблица 1.1 – Fracation 312table</w:t>
       </w:r>
     </w:p>
     <w:tbl>
       <w:tblPr>
+        <w:tblW w:w="5001" w:type="pct"/>
         <w:tblLayout w:type="fixed"/>
-        <w:tblLook w:firstColumn="1" w:firstRow="1" w:lastColumn="0" w:lastRow="0" w:noHBand="0" w:noVBand="1" w:val="04A0"/>
-        <w:tblW w:type="pct" w:w="5000"/>
+        <w:tblLook w:val="04A0" w:firstRow="1" w:lastRow="0" w:firstColumn="1" w:lastColumn="0" w:noHBand="0" w:noVBand="1"/>
       </w:tblPr>
       <w:tblGrid>
-        <w:gridCol w:w="3120"/>
-        <w:gridCol w:w="3120"/>
-        <w:gridCol w:w="3120"/>
-        <w:gridCol w:w="3120"/>
+        <w:gridCol w:w="2340"/>
+        <w:gridCol w:w="2338"/>
+        <w:gridCol w:w="467"/>
+        <w:gridCol w:w="467"/>
+        <w:gridCol w:w="468"/>
+        <w:gridCol w:w="467"/>
+        <w:gridCol w:w="468"/>
+        <w:gridCol w:w="2337"/>
       </w:tblGrid>
       <w:tr>
         <w:tc>
           <w:tcPr>
-            <w:tcW w:type="dxa" w:w="3120"/>
-            <w:vAlign w:val="center"/>
+            <w:tcW w:w="2339" w:type="dxa"/>
             <w:tcBorders>
-              <w:top w:val="single" w:sz="4" w:color="000000"/>
-              <w:left w:val="single" w:sz="4" w:color="000000"/>
-              <w:bottom w:val="single" w:sz="4" w:color="000000"/>
-              <w:right w:val="single" w:sz="4" w:color="000000"/>
+              <w:top w:val="single" w:sz="4" w:space="0" w:color="000000"/>
+              <w:left w:val="single" w:sz="4" w:space="0" w:color="000000"/>
+              <w:bottom w:val="single" w:sz="4" w:space="0" w:color="000000"/>
+              <w:right w:val="single" w:sz="4" w:space="0" w:color="000000"/>
             </w:tcBorders>
-          </w:tcPr>
-          <w:p>
-            <w:pPr>
-              <w:spacing w:line="240" w:lineRule="auto" w:before="0" w:after="0"/>
-              <w:ind w:left="0" w:right="0" w:firstLine="0"/>
+            <w:vAlign w:val="center"/>
+          </w:tcPr>
+          <w:p>
+            <w:pPr>
+              <w:spacing w:after="0" w:line="240" w:lineRule="auto"/>
               <w:jc w:val="center"/>
             </w:pPr>
             <w:r>
               <w:rPr>
                 <w:rFonts w:ascii="Times New Roman" w:hAnsi="Times New Roman"/>
-                <w:i w:val="0"/>
                 <w:color w:val="00FF00"/>
                 <w:sz w:val="24"/>
               </w:rPr>
@@ -80,82 +85,68 @@
         </w:tc>
         <w:tc>
           <w:tcPr>
-            <w:vAlign w:val="center"/>
+            <w:tcW w:w="4675" w:type="dxa"/>
+            <w:gridSpan w:val="6"/>
             <w:tcBorders>
-              <w:top w:val="single" w:sz="4" w:color="000000"/>
-              <w:left w:val="single" w:sz="4" w:color="000000"/>
-              <w:bottom w:val="single" w:sz="4" w:color="000000"/>
-              <w:right w:val="single" w:sz="4" w:color="000000"/>
+              <w:top w:val="single" w:sz="4" w:space="0" w:color="000000"/>
+              <w:left w:val="single" w:sz="4" w:space="0" w:color="000000"/>
+              <w:bottom w:val="single" w:sz="4" w:space="0" w:color="000000"/>
+              <w:right w:val="single" w:sz="4" w:space="0" w:color="auto"/>
             </w:tcBorders>
-          </w:tcPr>
-          <w:p>
-            <w:pPr>
-              <w:spacing w:line="240" w:lineRule="auto" w:before="0" w:after="0"/>
-              <w:ind w:left="0" w:right="0" w:firstLine="0"/>
+            <w:vAlign w:val="center"/>
+          </w:tcPr>
+          <w:p>
+            <w:pPr>
+              <w:spacing w:after="0" w:line="240" w:lineRule="auto"/>
               <w:jc w:val="center"/>
             </w:pPr>
             <w:r>
               <w:rPr>
                 <w:rFonts w:ascii="Times New Roman" w:hAnsi="Times New Roman"/>
-                <w:i w:val="0"/>
                 <w:color w:val="000000"/>
                 <w:sz w:val="24"/>
               </w:rPr>
-              <w:t>1</w:t>
+              <w:t>2</w:t>
             </w:r>
           </w:p>
-        </w:tc>
-        <w:tc>
-          <w:tcPr>
-            <w:vAlign w:val="center"/>
-            <w:tcBorders>
-              <w:top w:val="single" w:sz="4" w:color="000000"/>
-              <w:left w:val="single" w:sz="4" w:color="000000"/>
-              <w:bottom w:val="single" w:sz="4" w:color="000000"/>
-              <w:right w:val="single" w:sz="4" w:color="000000"/>
-            </w:tcBorders>
-          </w:tcPr>
-          <w:p>
-            <w:pPr>
-              <w:spacing w:line="240" w:lineRule="auto" w:before="0" w:after="0"/>
-              <w:ind w:left="0" w:right="0" w:firstLine="0"/>
+          <w:p>
+            <w:pPr>
+              <w:spacing w:after="0" w:line="240" w:lineRule="auto"/>
               <w:jc w:val="center"/>
             </w:pPr>
             <w:r>
               <w:rPr>
                 <w:rFonts w:ascii="Times New Roman" w:hAnsi="Times New Roman"/>
-                <w:i w:val="0"/>
                 <w:color w:val="000000"/>
                 <w:sz w:val="24"/>
               </w:rPr>
-              <w:t>афыафыафыфаф3 афы афыа фыа фы</w:t>
+              <w:t>3</w:t>
             </w:r>
           </w:p>
         </w:tc>
         <w:tc>
           <w:tcPr>
-            <w:vAlign w:val="center"/>
+            <w:tcW w:w="2337" w:type="dxa"/>
             <w:tcBorders>
-              <w:top w:val="single" w:sz="4" w:color="000000"/>
-              <w:left w:val="single" w:sz="4" w:color="000000"/>
-              <w:bottom w:val="single" w:sz="4" w:color="000000"/>
-              <w:right w:val="single" w:sz="4" w:color="000000"/>
+              <w:top w:val="single" w:sz="4" w:space="0" w:color="000000"/>
+              <w:left w:val="single" w:sz="4" w:space="0" w:color="auto"/>
+              <w:bottom w:val="single" w:sz="4" w:space="0" w:color="000000"/>
+              <w:right w:val="single" w:sz="4" w:space="0" w:color="000000"/>
             </w:tcBorders>
-          </w:tcPr>
-          <w:p>
-            <w:pPr>
-              <w:spacing w:line="240" w:lineRule="auto" w:before="0" w:after="0"/>
-              <w:ind w:left="0" w:right="0" w:firstLine="0"/>
+            <w:vAlign w:val="center"/>
+          </w:tcPr>
+          <w:p>
+            <w:pPr>
+              <w:spacing w:after="0" w:line="240" w:lineRule="auto"/>
               <w:jc w:val="center"/>
             </w:pPr>
             <w:r>
               <w:rPr>
                 <w:rFonts w:ascii="Times New Roman" w:hAnsi="Times New Roman"/>
-                <w:i w:val="0"/>
                 <w:color w:val="000000"/>
                 <w:sz w:val="24"/>
               </w:rPr>
-              <w:t>321увыф афыафыафыфаф3 афы афыа фыа фы</w:t>
+              <w:t>4</w:t>
             </w:r>
           </w:p>
         </w:tc>
@@ -163,250 +154,841 @@
       <w:tr>
         <w:tc>
           <w:tcPr>
-            <w:tcW w:type="dxa" w:w="3120"/>
-            <w:vAlign w:val="center"/>
+            <w:tcW w:w="4677" w:type="dxa"/>
+            <w:gridSpan w:val="2"/>
+            <w:vMerge w:val="restart"/>
             <w:tcBorders>
-              <w:top w:val="single" w:sz="4" w:color="000000"/>
-              <w:left w:val="single" w:sz="4" w:color="000000"/>
-              <w:bottom w:val="single" w:sz="4" w:color="000000"/>
-              <w:right w:val="single" w:sz="4" w:color="000000"/>
+              <w:top w:val="single" w:sz="4" w:space="0" w:color="000000"/>
+              <w:left w:val="single" w:sz="4" w:space="0" w:color="000000"/>
+              <w:right w:val="single" w:sz="4" w:space="0" w:color="000000"/>
             </w:tcBorders>
-          </w:tcPr>
-          <w:p>
-            <w:pPr>
-              <w:spacing w:line="240" w:lineRule="auto" w:before="0" w:after="0"/>
-              <w:ind w:left="0" w:right="0" w:firstLine="0"/>
+            <w:vAlign w:val="center"/>
+          </w:tcPr>
+          <w:p>
+            <w:pPr>
+              <w:spacing w:after="0" w:line="240" w:lineRule="auto"/>
               <w:jc w:val="center"/>
             </w:pPr>
             <w:r>
               <w:rPr>
                 <w:rFonts w:ascii="Times New Roman" w:hAnsi="Times New Roman"/>
-                <w:i w:val="0"/>
                 <w:color w:val="00FF00"/>
                 <w:sz w:val="24"/>
               </w:rPr>
-              <w:t>2</w:t>
+              <w:t>5</w:t>
             </w:r>
           </w:p>
-        </w:tc>
-        <w:tc>
-          <w:tcPr>
-            <w:vAlign w:val="center"/>
-            <w:tcBorders>
-              <w:top w:val="single" w:sz="4" w:color="000000"/>
-              <w:left w:val="single" w:sz="4" w:color="000000"/>
-              <w:bottom w:val="single" w:sz="4" w:color="000000"/>
-              <w:right w:val="single" w:sz="4" w:color="000000"/>
-            </w:tcBorders>
-          </w:tcPr>
-          <w:p>
-            <w:pPr>
-              <w:spacing w:line="240" w:lineRule="auto" w:before="0" w:after="0"/>
-              <w:ind w:left="0" w:right="0" w:firstLine="0"/>
+          <w:p>
+            <w:pPr>
+              <w:spacing w:after="0" w:line="240" w:lineRule="auto"/>
               <w:jc w:val="center"/>
             </w:pPr>
             <w:r>
               <w:rPr>
                 <w:rFonts w:ascii="Times New Roman" w:hAnsi="Times New Roman"/>
-                <w:i w:val="0"/>
                 <w:color w:val="000000"/>
                 <w:sz w:val="24"/>
               </w:rPr>
-              <w:t>2</w:t>
+              <w:t>6</w:t>
             </w:r>
           </w:p>
-        </w:tc>
-        <w:tc>
-          <w:tcPr>
-            <w:vAlign w:val="center"/>
-            <w:tcBorders>
-              <w:top w:val="single" w:sz="4" w:color="000000"/>
-              <w:left w:val="single" w:sz="4" w:color="000000"/>
-              <w:bottom w:val="single" w:sz="4" w:color="000000"/>
-              <w:right w:val="single" w:sz="4" w:color="000000"/>
-            </w:tcBorders>
-          </w:tcPr>
-          <w:p>
-            <w:pPr>
-              <w:spacing w:line="240" w:lineRule="auto" w:before="0" w:after="0"/>
-              <w:ind w:left="0" w:right="0" w:firstLine="0"/>
-              <w:jc w:val="center"/>
+          <w:p>
+            <w:pPr>
+              <w:spacing w:after="0" w:line="240" w:lineRule="auto"/>
+              <w:jc w:val="center"/>
+              <w:rPr>
+                <w:lang w:val="ru-RU"/>
+              </w:rPr>
             </w:pPr>
             <w:r>
               <w:rPr>
                 <w:rFonts w:ascii="Times New Roman" w:hAnsi="Times New Roman"/>
-                <w:i w:val="0"/>
                 <w:color w:val="000000"/>
                 <w:sz w:val="24"/>
-              </w:rPr>
-              <w:t>вфыв фыв фыв1в2 3</w:t>
+                <w:lang w:val="ru-RU"/>
+              </w:rPr>
+              <w:t>9</w:t>
             </w:r>
           </w:p>
-        </w:tc>
-        <w:tc>
-          <w:tcPr>
-            <w:vAlign w:val="center"/>
-            <w:tcBorders>
-              <w:top w:val="single" w:sz="4" w:color="000000"/>
-              <w:left w:val="single" w:sz="4" w:color="000000"/>
-              <w:bottom w:val="single" w:sz="4" w:color="000000"/>
-              <w:right w:val="single" w:sz="4" w:color="000000"/>
-            </w:tcBorders>
-          </w:tcPr>
-          <w:p>
-            <w:pPr>
-              <w:spacing w:line="240" w:lineRule="auto" w:before="0" w:after="0"/>
-              <w:ind w:left="0" w:right="0" w:firstLine="0"/>
+          <w:p>
+            <w:pPr>
+              <w:spacing w:after="0" w:line="240" w:lineRule="auto"/>
               <w:jc w:val="center"/>
             </w:pPr>
             <w:r>
               <w:rPr>
                 <w:rFonts w:ascii="Times New Roman" w:hAnsi="Times New Roman"/>
-                <w:i w:val="0"/>
                 <w:color w:val="000000"/>
                 <w:sz w:val="24"/>
-              </w:rPr>
-              <w:t xml:space="preserve">3вфыв  ыфв фыв фыв 1у2ву1 </w:t>
+                <w:lang w:val="ru-RU"/>
+              </w:rPr>
+              <w:t>10</w:t>
+            </w:r>
+          </w:p>
+        </w:tc>
+        <w:tc>
+          <w:tcPr>
+            <w:tcW w:w="2337" w:type="dxa"/>
+            <w:gridSpan w:val="5"/>
+            <w:tcBorders>
+              <w:top w:val="single" w:sz="4" w:space="0" w:color="000000"/>
+              <w:left w:val="single" w:sz="4" w:space="0" w:color="000000"/>
+              <w:bottom w:val="single" w:sz="4" w:space="0" w:color="000000"/>
+              <w:right w:val="single" w:sz="4" w:space="0" w:color="auto"/>
+            </w:tcBorders>
+            <w:vAlign w:val="center"/>
+          </w:tcPr>
+          <w:p>
+            <w:pPr>
+              <w:spacing w:after="0" w:line="240" w:lineRule="auto"/>
+              <w:jc w:val="center"/>
+            </w:pPr>
+            <w:r>
+              <w:rPr>
+                <w:rFonts w:ascii="Times New Roman" w:hAnsi="Times New Roman"/>
+                <w:color w:val="000000"/>
+                <w:sz w:val="24"/>
+              </w:rPr>
+              <w:t>7</w:t>
+            </w:r>
+          </w:p>
+        </w:tc>
+        <w:tc>
+          <w:tcPr>
+            <w:tcW w:w="2337" w:type="dxa"/>
+            <w:vMerge w:val="restart"/>
+            <w:tcBorders>
+              <w:top w:val="single" w:sz="4" w:space="0" w:color="000000"/>
+              <w:left w:val="single" w:sz="4" w:space="0" w:color="auto"/>
+              <w:right w:val="single" w:sz="4" w:space="0" w:color="000000"/>
+            </w:tcBorders>
+            <w:vAlign w:val="center"/>
+          </w:tcPr>
+          <w:p>
+            <w:pPr>
+              <w:spacing w:after="0" w:line="240" w:lineRule="auto"/>
+              <w:jc w:val="center"/>
+              <w:rPr>
+                <w:lang w:val="ru-RU"/>
+              </w:rPr>
+            </w:pPr>
+            <w:r>
+              <w:rPr>
+                <w:rFonts w:ascii="Times New Roman" w:hAnsi="Times New Roman"/>
+                <w:color w:val="000000"/>
+                <w:sz w:val="24"/>
+                <w:lang w:val="ru-RU"/>
+              </w:rPr>
+              <w:t>8</w:t>
+            </w:r>
+          </w:p>
+          <w:p>
+            <w:pPr>
+              <w:spacing w:after="0" w:line="240" w:lineRule="auto"/>
+              <w:jc w:val="center"/>
+              <w:rPr>
+                <w:lang w:val="ru-RU"/>
+              </w:rPr>
+            </w:pPr>
+            <w:r>
+              <w:rPr>
+                <w:rFonts w:ascii="Times New Roman" w:hAnsi="Times New Roman"/>
+                <w:color w:val="000000"/>
+                <w:sz w:val="24"/>
+                <w:lang w:val="ru-RU"/>
+              </w:rPr>
+              <w:t>12</w:t>
             </w:r>
           </w:p>
         </w:tc>
       </w:tr>
       <w:tr>
-        <w:tc>
-          <w:tcPr>
-            <w:tcW w:type="dxa" w:w="3120"/>
-            <w:vAlign w:val="center"/>
+        <w:trPr>
+          <w:trHeight w:val="157"/>
+        </w:trPr>
+        <w:tc>
+          <w:tcPr>
+            <w:tcW w:w="4677" w:type="dxa"/>
+            <w:gridSpan w:val="2"/>
+            <w:vMerge/>
             <w:tcBorders>
-              <w:top w:val="single" w:sz="4" w:color="000000"/>
-              <w:left w:val="single" w:sz="4" w:color="000000"/>
-              <w:bottom w:val="single" w:sz="4" w:color="000000"/>
-              <w:right w:val="single" w:sz="4" w:color="000000"/>
+              <w:left w:val="single" w:sz="4" w:space="0" w:color="000000"/>
+              <w:right w:val="single" w:sz="4" w:space="0" w:color="000000"/>
             </w:tcBorders>
-          </w:tcPr>
-          <w:p>
-            <w:pPr>
-              <w:spacing w:line="240" w:lineRule="auto" w:before="0" w:after="0"/>
-              <w:ind w:left="0" w:right="0" w:firstLine="0"/>
-              <w:jc w:val="center"/>
+            <w:vAlign w:val="center"/>
+          </w:tcPr>
+          <w:p>
+            <w:pPr>
+              <w:spacing w:after="0" w:line="240" w:lineRule="auto"/>
+              <w:jc w:val="center"/>
+              <w:rPr>
+                <w:lang w:val="ru-RU"/>
+              </w:rPr>
+            </w:pPr>
+          </w:p>
+        </w:tc>
+        <w:tc>
+          <w:tcPr>
+            <w:tcW w:w="467" w:type="dxa"/>
+            <w:tcBorders>
+              <w:top w:val="single" w:sz="4" w:space="0" w:color="000000"/>
+              <w:left w:val="single" w:sz="4" w:space="0" w:color="000000"/>
+              <w:bottom w:val="single" w:sz="4" w:space="0" w:color="000000"/>
+              <w:right w:val="single" w:sz="4" w:space="0" w:color="000000"/>
+            </w:tcBorders>
+            <w:vAlign w:val="center"/>
+          </w:tcPr>
+          <w:p>
+            <w:pPr>
+              <w:spacing w:after="0" w:line="240" w:lineRule="auto"/>
+              <w:jc w:val="center"/>
+              <w:rPr>
+                <w:lang w:val="ru-RU"/>
+              </w:rPr>
             </w:pPr>
             <w:r>
               <w:rPr>
                 <w:rFonts w:ascii="Times New Roman" w:hAnsi="Times New Roman"/>
-                <w:i w:val="0"/>
                 <w:color w:val="000000"/>
                 <w:sz w:val="24"/>
-              </w:rPr>
-              <w:t>афыафыафыфаф3 афы афыа фыа фы</w:t>
+                <w:lang w:val="ru-RU"/>
+              </w:rPr>
+              <w:t>11</w:t>
             </w:r>
           </w:p>
         </w:tc>
         <w:tc>
           <w:tcPr>
-            <w:tcW w:type="dxa" w:w="3120"/>
-            <w:vAlign w:val="center"/>
+            <w:tcW w:w="467" w:type="dxa"/>
             <w:tcBorders>
-              <w:top w:val="single" w:sz="4" w:color="000000"/>
-              <w:left w:val="single" w:sz="4" w:color="000000"/>
-              <w:bottom w:val="single" w:sz="4" w:color="000000"/>
-              <w:right w:val="single" w:sz="4" w:color="000000"/>
+              <w:top w:val="single" w:sz="4" w:space="0" w:color="000000"/>
+              <w:left w:val="single" w:sz="4" w:space="0" w:color="000000"/>
+              <w:bottom w:val="single" w:sz="4" w:space="0" w:color="000000"/>
+              <w:right w:val="single" w:sz="4" w:space="0" w:color="000000"/>
             </w:tcBorders>
-          </w:tcPr>
-          <w:p>
-            <w:pPr>
-              <w:spacing w:line="240" w:lineRule="auto" w:before="0" w:after="0"/>
-              <w:ind w:left="0" w:right="0" w:firstLine="0"/>
-              <w:jc w:val="center"/>
-            </w:pPr>
-            <w:r>
+            <w:vAlign w:val="center"/>
+          </w:tcPr>
+          <w:p>
+            <w:pPr>
+              <w:spacing w:after="0" w:line="240" w:lineRule="auto"/>
+              <w:jc w:val="center"/>
+              <w:rPr>
+                <w:lang w:val="ru-RU"/>
+              </w:rPr>
+            </w:pPr>
+          </w:p>
+        </w:tc>
+        <w:tc>
+          <w:tcPr>
+            <w:tcW w:w="468" w:type="dxa"/>
+            <w:tcBorders>
+              <w:top w:val="single" w:sz="4" w:space="0" w:color="000000"/>
+              <w:left w:val="single" w:sz="4" w:space="0" w:color="000000"/>
+              <w:bottom w:val="single" w:sz="4" w:space="0" w:color="000000"/>
+              <w:right w:val="single" w:sz="4" w:space="0" w:color="000000"/>
+            </w:tcBorders>
+            <w:vAlign w:val="center"/>
+          </w:tcPr>
+          <w:p>
+            <w:pPr>
+              <w:spacing w:after="0" w:line="240" w:lineRule="auto"/>
+              <w:jc w:val="center"/>
+              <w:rPr>
+                <w:lang w:val="ru-RU"/>
+              </w:rPr>
+            </w:pPr>
+          </w:p>
+        </w:tc>
+        <w:tc>
+          <w:tcPr>
+            <w:tcW w:w="467" w:type="dxa"/>
+            <w:tcBorders>
+              <w:top w:val="single" w:sz="4" w:space="0" w:color="000000"/>
+              <w:left w:val="single" w:sz="4" w:space="0" w:color="000000"/>
+              <w:bottom w:val="single" w:sz="4" w:space="0" w:color="000000"/>
+              <w:right w:val="single" w:sz="4" w:space="0" w:color="000000"/>
+            </w:tcBorders>
+            <w:vAlign w:val="center"/>
+          </w:tcPr>
+          <w:p>
+            <w:pPr>
+              <w:spacing w:after="0" w:line="240" w:lineRule="auto"/>
+              <w:jc w:val="center"/>
+              <w:rPr>
+                <w:lang w:val="ru-RU"/>
+              </w:rPr>
+            </w:pPr>
+          </w:p>
+        </w:tc>
+        <w:tc>
+          <w:tcPr>
+            <w:tcW w:w="468" w:type="dxa"/>
+            <w:tcBorders>
+              <w:top w:val="single" w:sz="4" w:space="0" w:color="000000"/>
+              <w:left w:val="single" w:sz="4" w:space="0" w:color="000000"/>
+              <w:bottom w:val="single" w:sz="4" w:space="0" w:color="000000"/>
+              <w:right w:val="single" w:sz="4" w:space="0" w:color="auto"/>
+            </w:tcBorders>
+            <w:vAlign w:val="center"/>
+          </w:tcPr>
+          <w:p>
+            <w:pPr>
+              <w:spacing w:after="0" w:line="240" w:lineRule="auto"/>
+              <w:jc w:val="center"/>
+              <w:rPr>
+                <w:lang w:val="ru-RU"/>
+              </w:rPr>
+            </w:pPr>
+          </w:p>
+        </w:tc>
+        <w:tc>
+          <w:tcPr>
+            <w:tcW w:w="2337" w:type="dxa"/>
+            <w:vMerge/>
+            <w:tcBorders>
+              <w:left w:val="single" w:sz="4" w:space="0" w:color="auto"/>
+              <w:right w:val="single" w:sz="4" w:space="0" w:color="000000"/>
+            </w:tcBorders>
+            <w:vAlign w:val="center"/>
+          </w:tcPr>
+          <w:p>
+            <w:pPr>
+              <w:spacing w:after="0" w:line="240" w:lineRule="auto"/>
+              <w:jc w:val="center"/>
+              <w:rPr>
+                <w:lang w:val="ru-RU"/>
+              </w:rPr>
+            </w:pPr>
+          </w:p>
+        </w:tc>
+      </w:tr>
+      <w:tr>
+        <w:trPr>
+          <w:trHeight w:val="157"/>
+        </w:trPr>
+        <w:tc>
+          <w:tcPr>
+            <w:tcW w:w="4677" w:type="dxa"/>
+            <w:gridSpan w:val="2"/>
+            <w:vMerge/>
+            <w:tcBorders>
+              <w:left w:val="single" w:sz="4" w:space="0" w:color="000000"/>
+              <w:right w:val="single" w:sz="4" w:space="0" w:color="000000"/>
+            </w:tcBorders>
+            <w:vAlign w:val="center"/>
+          </w:tcPr>
+          <w:p>
+            <w:pPr>
+              <w:spacing w:after="0" w:line="240" w:lineRule="auto"/>
+              <w:jc w:val="center"/>
+              <w:rPr>
+                <w:lang w:val="ru-RU"/>
+              </w:rPr>
+            </w:pPr>
+          </w:p>
+        </w:tc>
+        <w:tc>
+          <w:tcPr>
+            <w:tcW w:w="467" w:type="dxa"/>
+            <w:tcBorders>
+              <w:top w:val="single" w:sz="4" w:space="0" w:color="000000"/>
+              <w:left w:val="single" w:sz="4" w:space="0" w:color="000000"/>
+              <w:bottom w:val="single" w:sz="4" w:space="0" w:color="000000"/>
+              <w:right w:val="single" w:sz="4" w:space="0" w:color="000000"/>
+            </w:tcBorders>
+            <w:vAlign w:val="center"/>
+          </w:tcPr>
+          <w:p>
+            <w:pPr>
+              <w:spacing w:after="0" w:line="240" w:lineRule="auto"/>
+              <w:jc w:val="center"/>
               <w:rPr>
                 <w:rFonts w:ascii="Times New Roman" w:hAnsi="Times New Roman"/>
-                <w:i w:val="0"/>
                 <w:color w:val="000000"/>
                 <w:sz w:val="24"/>
-              </w:rPr>
-              <w:t>321увыф афыа321321фыафыфаф3 афы афыа фыа фы</w:t>
-            </w:r>
-          </w:p>
-        </w:tc>
-        <w:tc>
-          <w:tcPr>
-            <w:vAlign w:val="center"/>
+                <w:lang w:val="ru-RU"/>
+              </w:rPr>
+            </w:pPr>
+          </w:p>
+        </w:tc>
+        <w:tc>
+          <w:tcPr>
+            <w:tcW w:w="467" w:type="dxa"/>
             <w:tcBorders>
-              <w:top w:val="single" w:sz="4" w:color="000000"/>
-              <w:left w:val="single" w:sz="4" w:color="000000"/>
-              <w:bottom w:val="single" w:sz="4" w:color="000000"/>
-              <w:right w:val="single" w:sz="4" w:color="000000"/>
+              <w:top w:val="single" w:sz="4" w:space="0" w:color="000000"/>
+              <w:left w:val="single" w:sz="4" w:space="0" w:color="000000"/>
+              <w:bottom w:val="single" w:sz="4" w:space="0" w:color="000000"/>
+              <w:right w:val="single" w:sz="4" w:space="0" w:color="000000"/>
             </w:tcBorders>
-          </w:tcPr>
-          <w:p>
-            <w:pPr>
-              <w:spacing w:line="240" w:lineRule="auto" w:before="0" w:after="0"/>
-              <w:ind w:left="0" w:right="0" w:firstLine="0"/>
-              <w:jc w:val="center"/>
-            </w:pPr>
-            <w:r>
+            <w:vAlign w:val="center"/>
+          </w:tcPr>
+          <w:p>
+            <w:pPr>
+              <w:spacing w:after="0" w:line="240" w:lineRule="auto"/>
+              <w:jc w:val="center"/>
               <w:rPr>
                 <w:rFonts w:ascii="Times New Roman" w:hAnsi="Times New Roman"/>
-                <w:i w:val="0"/>
                 <w:color w:val="000000"/>
                 <w:sz w:val="24"/>
-              </w:rPr>
-              <w:t>321увыф афыафыафыфаф3 афы афыа фыа фы</w:t>
-            </w:r>
-          </w:p>
-        </w:tc>
-        <w:tc>
-          <w:tcPr>
-            <w:vAlign w:val="center"/>
+                <w:lang w:val="ru-RU"/>
+              </w:rPr>
+            </w:pPr>
+          </w:p>
+        </w:tc>
+        <w:tc>
+          <w:tcPr>
+            <w:tcW w:w="468" w:type="dxa"/>
             <w:tcBorders>
-              <w:top w:val="single" w:sz="4" w:color="000000"/>
-              <w:left w:val="single" w:sz="4" w:color="000000"/>
-              <w:bottom w:val="single" w:sz="4" w:color="000000"/>
-              <w:right w:val="single" w:sz="4" w:color="000000"/>
+              <w:top w:val="single" w:sz="4" w:space="0" w:color="000000"/>
+              <w:left w:val="single" w:sz="4" w:space="0" w:color="000000"/>
+              <w:bottom w:val="single" w:sz="4" w:space="0" w:color="000000"/>
+              <w:right w:val="single" w:sz="4" w:space="0" w:color="000000"/>
             </w:tcBorders>
-          </w:tcPr>
-          <w:p>
-            <w:pPr>
-              <w:spacing w:line="240" w:lineRule="auto" w:before="0" w:after="0"/>
-              <w:ind w:left="0" w:right="0" w:firstLine="0"/>
-              <w:jc w:val="center"/>
-            </w:pPr>
-            <w:r>
+            <w:vAlign w:val="center"/>
+          </w:tcPr>
+          <w:p>
+            <w:pPr>
+              <w:spacing w:after="0" w:line="240" w:lineRule="auto"/>
+              <w:jc w:val="center"/>
               <w:rPr>
                 <w:rFonts w:ascii="Times New Roman" w:hAnsi="Times New Roman"/>
-                <w:i w:val="0"/>
                 <w:color w:val="000000"/>
                 <w:sz w:val="24"/>
-              </w:rPr>
-              <w:t>321увыф афыафыафыфаф3 афы афыа фыа фы</w:t>
-            </w:r>
+                <w:lang w:val="ru-RU"/>
+              </w:rPr>
+            </w:pPr>
+          </w:p>
+        </w:tc>
+        <w:tc>
+          <w:tcPr>
+            <w:tcW w:w="467" w:type="dxa"/>
+            <w:tcBorders>
+              <w:top w:val="single" w:sz="4" w:space="0" w:color="000000"/>
+              <w:left w:val="single" w:sz="4" w:space="0" w:color="000000"/>
+              <w:bottom w:val="single" w:sz="4" w:space="0" w:color="000000"/>
+              <w:right w:val="single" w:sz="4" w:space="0" w:color="000000"/>
+            </w:tcBorders>
+            <w:vAlign w:val="center"/>
+          </w:tcPr>
+          <w:p>
+            <w:pPr>
+              <w:spacing w:after="0" w:line="240" w:lineRule="auto"/>
+              <w:jc w:val="center"/>
+              <w:rPr>
+                <w:rFonts w:ascii="Times New Roman" w:hAnsi="Times New Roman"/>
+                <w:color w:val="000000"/>
+                <w:sz w:val="24"/>
+                <w:lang w:val="ru-RU"/>
+              </w:rPr>
+            </w:pPr>
+          </w:p>
+        </w:tc>
+        <w:tc>
+          <w:tcPr>
+            <w:tcW w:w="468" w:type="dxa"/>
+            <w:tcBorders>
+              <w:top w:val="single" w:sz="4" w:space="0" w:color="000000"/>
+              <w:left w:val="single" w:sz="4" w:space="0" w:color="000000"/>
+              <w:bottom w:val="single" w:sz="4" w:space="0" w:color="000000"/>
+              <w:right w:val="single" w:sz="4" w:space="0" w:color="auto"/>
+            </w:tcBorders>
+            <w:vAlign w:val="center"/>
+          </w:tcPr>
+          <w:p>
+            <w:pPr>
+              <w:spacing w:after="0" w:line="240" w:lineRule="auto"/>
+              <w:jc w:val="center"/>
+              <w:rPr>
+                <w:rFonts w:ascii="Times New Roman" w:hAnsi="Times New Roman"/>
+                <w:color w:val="000000"/>
+                <w:sz w:val="24"/>
+                <w:lang w:val="ru-RU"/>
+              </w:rPr>
+            </w:pPr>
+          </w:p>
+        </w:tc>
+        <w:tc>
+          <w:tcPr>
+            <w:tcW w:w="2337" w:type="dxa"/>
+            <w:vMerge/>
+            <w:tcBorders>
+              <w:left w:val="single" w:sz="4" w:space="0" w:color="auto"/>
+              <w:right w:val="single" w:sz="4" w:space="0" w:color="000000"/>
+            </w:tcBorders>
+            <w:vAlign w:val="center"/>
+          </w:tcPr>
+          <w:p>
+            <w:pPr>
+              <w:spacing w:after="0" w:line="240" w:lineRule="auto"/>
+              <w:jc w:val="center"/>
+              <w:rPr>
+                <w:lang w:val="ru-RU"/>
+              </w:rPr>
+            </w:pPr>
+          </w:p>
+        </w:tc>
+      </w:tr>
+      <w:tr>
+        <w:trPr>
+          <w:trHeight w:val="157"/>
+        </w:trPr>
+        <w:tc>
+          <w:tcPr>
+            <w:tcW w:w="4677" w:type="dxa"/>
+            <w:gridSpan w:val="2"/>
+            <w:vMerge/>
+            <w:tcBorders>
+              <w:left w:val="single" w:sz="4" w:space="0" w:color="000000"/>
+              <w:right w:val="single" w:sz="4" w:space="0" w:color="000000"/>
+            </w:tcBorders>
+            <w:vAlign w:val="center"/>
+          </w:tcPr>
+          <w:p>
+            <w:pPr>
+              <w:spacing w:after="0" w:line="240" w:lineRule="auto"/>
+              <w:jc w:val="center"/>
+              <w:rPr>
+                <w:lang w:val="ru-RU"/>
+              </w:rPr>
+            </w:pPr>
+          </w:p>
+        </w:tc>
+        <w:tc>
+          <w:tcPr>
+            <w:tcW w:w="467" w:type="dxa"/>
+            <w:tcBorders>
+              <w:top w:val="single" w:sz="4" w:space="0" w:color="000000"/>
+              <w:left w:val="single" w:sz="4" w:space="0" w:color="000000"/>
+              <w:bottom w:val="single" w:sz="4" w:space="0" w:color="000000"/>
+              <w:right w:val="single" w:sz="4" w:space="0" w:color="000000"/>
+            </w:tcBorders>
+            <w:vAlign w:val="center"/>
+          </w:tcPr>
+          <w:p>
+            <w:pPr>
+              <w:spacing w:after="0" w:line="240" w:lineRule="auto"/>
+              <w:jc w:val="center"/>
+              <w:rPr>
+                <w:rFonts w:ascii="Times New Roman" w:hAnsi="Times New Roman"/>
+                <w:color w:val="000000"/>
+                <w:sz w:val="24"/>
+                <w:lang w:val="ru-RU"/>
+              </w:rPr>
+            </w:pPr>
+          </w:p>
+        </w:tc>
+        <w:tc>
+          <w:tcPr>
+            <w:tcW w:w="467" w:type="dxa"/>
+            <w:tcBorders>
+              <w:top w:val="single" w:sz="4" w:space="0" w:color="000000"/>
+              <w:left w:val="single" w:sz="4" w:space="0" w:color="000000"/>
+              <w:bottom w:val="single" w:sz="4" w:space="0" w:color="000000"/>
+              <w:right w:val="single" w:sz="4" w:space="0" w:color="000000"/>
+            </w:tcBorders>
+            <w:vAlign w:val="center"/>
+          </w:tcPr>
+          <w:p>
+            <w:pPr>
+              <w:spacing w:after="0" w:line="240" w:lineRule="auto"/>
+              <w:jc w:val="center"/>
+              <w:rPr>
+                <w:rFonts w:ascii="Times New Roman" w:hAnsi="Times New Roman"/>
+                <w:color w:val="000000"/>
+                <w:sz w:val="24"/>
+                <w:lang w:val="ru-RU"/>
+              </w:rPr>
+            </w:pPr>
+          </w:p>
+        </w:tc>
+        <w:tc>
+          <w:tcPr>
+            <w:tcW w:w="468" w:type="dxa"/>
+            <w:tcBorders>
+              <w:top w:val="single" w:sz="4" w:space="0" w:color="000000"/>
+              <w:left w:val="single" w:sz="4" w:space="0" w:color="000000"/>
+              <w:bottom w:val="single" w:sz="4" w:space="0" w:color="000000"/>
+              <w:right w:val="single" w:sz="4" w:space="0" w:color="000000"/>
+            </w:tcBorders>
+            <w:vAlign w:val="center"/>
+          </w:tcPr>
+          <w:p>
+            <w:pPr>
+              <w:spacing w:after="0" w:line="240" w:lineRule="auto"/>
+              <w:jc w:val="center"/>
+              <w:rPr>
+                <w:rFonts w:ascii="Times New Roman" w:hAnsi="Times New Roman"/>
+                <w:color w:val="000000"/>
+                <w:sz w:val="24"/>
+                <w:lang w:val="ru-RU"/>
+              </w:rPr>
+            </w:pPr>
+          </w:p>
+        </w:tc>
+        <w:tc>
+          <w:tcPr>
+            <w:tcW w:w="467" w:type="dxa"/>
+            <w:tcBorders>
+              <w:top w:val="single" w:sz="4" w:space="0" w:color="000000"/>
+              <w:left w:val="single" w:sz="4" w:space="0" w:color="000000"/>
+              <w:bottom w:val="single" w:sz="4" w:space="0" w:color="000000"/>
+              <w:right w:val="single" w:sz="4" w:space="0" w:color="000000"/>
+            </w:tcBorders>
+            <w:vAlign w:val="center"/>
+          </w:tcPr>
+          <w:p>
+            <w:pPr>
+              <w:spacing w:after="0" w:line="240" w:lineRule="auto"/>
+              <w:jc w:val="center"/>
+              <w:rPr>
+                <w:rFonts w:ascii="Times New Roman" w:hAnsi="Times New Roman"/>
+                <w:color w:val="000000"/>
+                <w:sz w:val="24"/>
+                <w:lang w:val="ru-RU"/>
+              </w:rPr>
+            </w:pPr>
+          </w:p>
+        </w:tc>
+        <w:tc>
+          <w:tcPr>
+            <w:tcW w:w="468" w:type="dxa"/>
+            <w:tcBorders>
+              <w:top w:val="single" w:sz="4" w:space="0" w:color="000000"/>
+              <w:left w:val="single" w:sz="4" w:space="0" w:color="000000"/>
+              <w:bottom w:val="single" w:sz="4" w:space="0" w:color="000000"/>
+              <w:right w:val="single" w:sz="4" w:space="0" w:color="auto"/>
+            </w:tcBorders>
+            <w:vAlign w:val="center"/>
+          </w:tcPr>
+          <w:p>
+            <w:pPr>
+              <w:spacing w:after="0" w:line="240" w:lineRule="auto"/>
+              <w:jc w:val="center"/>
+              <w:rPr>
+                <w:rFonts w:ascii="Times New Roman" w:hAnsi="Times New Roman"/>
+                <w:color w:val="000000"/>
+                <w:sz w:val="24"/>
+                <w:lang w:val="ru-RU"/>
+              </w:rPr>
+            </w:pPr>
+          </w:p>
+        </w:tc>
+        <w:tc>
+          <w:tcPr>
+            <w:tcW w:w="2337" w:type="dxa"/>
+            <w:vMerge/>
+            <w:tcBorders>
+              <w:left w:val="single" w:sz="4" w:space="0" w:color="auto"/>
+              <w:right w:val="single" w:sz="4" w:space="0" w:color="000000"/>
+            </w:tcBorders>
+            <w:vAlign w:val="center"/>
+          </w:tcPr>
+          <w:p>
+            <w:pPr>
+              <w:spacing w:after="0" w:line="240" w:lineRule="auto"/>
+              <w:jc w:val="center"/>
+              <w:rPr>
+                <w:lang w:val="ru-RU"/>
+              </w:rPr>
+            </w:pPr>
+          </w:p>
+        </w:tc>
+      </w:tr>
+      <w:tr>
+        <w:trPr>
+          <w:trHeight w:val="157"/>
+        </w:trPr>
+        <w:tc>
+          <w:tcPr>
+            <w:tcW w:w="4677" w:type="dxa"/>
+            <w:gridSpan w:val="2"/>
+            <w:vMerge/>
+            <w:tcBorders>
+              <w:left w:val="single" w:sz="4" w:space="0" w:color="000000"/>
+              <w:bottom w:val="single" w:sz="4" w:space="0" w:color="000000"/>
+              <w:right w:val="single" w:sz="4" w:space="0" w:color="000000"/>
+            </w:tcBorders>
+            <w:vAlign w:val="center"/>
+          </w:tcPr>
+          <w:p>
+            <w:pPr>
+              <w:spacing w:after="0" w:line="240" w:lineRule="auto"/>
+              <w:jc w:val="center"/>
+              <w:rPr>
+                <w:lang w:val="ru-RU"/>
+              </w:rPr>
+            </w:pPr>
+          </w:p>
+        </w:tc>
+        <w:tc>
+          <w:tcPr>
+            <w:tcW w:w="467" w:type="dxa"/>
+            <w:tcBorders>
+              <w:top w:val="single" w:sz="4" w:space="0" w:color="000000"/>
+              <w:left w:val="single" w:sz="4" w:space="0" w:color="000000"/>
+              <w:bottom w:val="single" w:sz="4" w:space="0" w:color="000000"/>
+              <w:right w:val="single" w:sz="4" w:space="0" w:color="000000"/>
+            </w:tcBorders>
+            <w:vAlign w:val="center"/>
+          </w:tcPr>
+          <w:p>
+            <w:pPr>
+              <w:spacing w:after="0" w:line="240" w:lineRule="auto"/>
+              <w:jc w:val="center"/>
+              <w:rPr>
+                <w:rFonts w:ascii="Times New Roman" w:hAnsi="Times New Roman"/>
+                <w:color w:val="000000"/>
+                <w:sz w:val="24"/>
+                <w:lang w:val="ru-RU"/>
+              </w:rPr>
+            </w:pPr>
+          </w:p>
+        </w:tc>
+        <w:tc>
+          <w:tcPr>
+            <w:tcW w:w="467" w:type="dxa"/>
+            <w:tcBorders>
+              <w:top w:val="single" w:sz="4" w:space="0" w:color="000000"/>
+              <w:left w:val="single" w:sz="4" w:space="0" w:color="000000"/>
+              <w:bottom w:val="single" w:sz="4" w:space="0" w:color="000000"/>
+              <w:right w:val="single" w:sz="4" w:space="0" w:color="000000"/>
+            </w:tcBorders>
+            <w:vAlign w:val="center"/>
+          </w:tcPr>
+          <w:p>
+            <w:pPr>
+              <w:spacing w:after="0" w:line="240" w:lineRule="auto"/>
+              <w:jc w:val="center"/>
+              <w:rPr>
+                <w:rFonts w:ascii="Times New Roman" w:hAnsi="Times New Roman"/>
+                <w:color w:val="000000"/>
+                <w:sz w:val="24"/>
+                <w:lang w:val="ru-RU"/>
+              </w:rPr>
+            </w:pPr>
+          </w:p>
+        </w:tc>
+        <w:tc>
+          <w:tcPr>
+            <w:tcW w:w="468" w:type="dxa"/>
+            <w:tcBorders>
+              <w:top w:val="single" w:sz="4" w:space="0" w:color="000000"/>
+              <w:left w:val="single" w:sz="4" w:space="0" w:color="000000"/>
+              <w:bottom w:val="single" w:sz="4" w:space="0" w:color="000000"/>
+              <w:right w:val="single" w:sz="4" w:space="0" w:color="000000"/>
+            </w:tcBorders>
+            <w:vAlign w:val="center"/>
+          </w:tcPr>
+          <w:p>
+            <w:pPr>
+              <w:spacing w:after="0" w:line="240" w:lineRule="auto"/>
+              <w:jc w:val="center"/>
+              <w:rPr>
+                <w:rFonts w:ascii="Times New Roman" w:hAnsi="Times New Roman"/>
+                <w:color w:val="000000"/>
+                <w:sz w:val="24"/>
+                <w:lang w:val="ru-RU"/>
+              </w:rPr>
+            </w:pPr>
+          </w:p>
+        </w:tc>
+        <w:tc>
+          <w:tcPr>
+            <w:tcW w:w="467" w:type="dxa"/>
+            <w:tcBorders>
+              <w:top w:val="single" w:sz="4" w:space="0" w:color="000000"/>
+              <w:left w:val="single" w:sz="4" w:space="0" w:color="000000"/>
+              <w:bottom w:val="single" w:sz="4" w:space="0" w:color="000000"/>
+              <w:right w:val="single" w:sz="4" w:space="0" w:color="000000"/>
+            </w:tcBorders>
+            <w:vAlign w:val="center"/>
+          </w:tcPr>
+          <w:p>
+            <w:pPr>
+              <w:spacing w:after="0" w:line="240" w:lineRule="auto"/>
+              <w:jc w:val="center"/>
+              <w:rPr>
+                <w:rFonts w:ascii="Times New Roman" w:hAnsi="Times New Roman"/>
+                <w:color w:val="000000"/>
+                <w:sz w:val="24"/>
+                <w:lang w:val="ru-RU"/>
+              </w:rPr>
+            </w:pPr>
+          </w:p>
+        </w:tc>
+        <w:tc>
+          <w:tcPr>
+            <w:tcW w:w="468" w:type="dxa"/>
+            <w:tcBorders>
+              <w:top w:val="single" w:sz="4" w:space="0" w:color="000000"/>
+              <w:left w:val="single" w:sz="4" w:space="0" w:color="000000"/>
+              <w:bottom w:val="single" w:sz="4" w:space="0" w:color="000000"/>
+              <w:right w:val="single" w:sz="4" w:space="0" w:color="auto"/>
+            </w:tcBorders>
+            <w:vAlign w:val="center"/>
+          </w:tcPr>
+          <w:p>
+            <w:pPr>
+              <w:spacing w:after="0" w:line="240" w:lineRule="auto"/>
+              <w:jc w:val="center"/>
+              <w:rPr>
+                <w:rFonts w:ascii="Times New Roman" w:hAnsi="Times New Roman"/>
+                <w:color w:val="000000"/>
+                <w:sz w:val="24"/>
+                <w:lang w:val="ru-RU"/>
+              </w:rPr>
+            </w:pPr>
+          </w:p>
+        </w:tc>
+        <w:tc>
+          <w:tcPr>
+            <w:tcW w:w="2337" w:type="dxa"/>
+            <w:vMerge/>
+            <w:tcBorders>
+              <w:left w:val="single" w:sz="4" w:space="0" w:color="auto"/>
+              <w:bottom w:val="single" w:sz="4" w:space="0" w:color="000000"/>
+              <w:right w:val="single" w:sz="4" w:space="0" w:color="000000"/>
+            </w:tcBorders>
+            <w:vAlign w:val="center"/>
+          </w:tcPr>
+          <w:p>
+            <w:pPr>
+              <w:spacing w:after="0" w:line="240" w:lineRule="auto"/>
+              <w:jc w:val="center"/>
+              <w:rPr>
+                <w:lang w:val="ru-RU"/>
+              </w:rPr>
+            </w:pPr>
           </w:p>
         </w:tc>
       </w:tr>
     </w:tbl>
     <w:p>
       <w:pPr>
-        <w:spacing w:line="240" w:lineRule="auto" w:before="280" w:after="0"/>
-        <w:ind w:left="0" w:right="0" w:firstLine="0"/>
+        <w:spacing w:before="280" w:after="0" w:line="240" w:lineRule="auto"/>
         <w:jc w:val="center"/>
       </w:pPr>
       <w:r>
+        <w:rPr>
+          <w:noProof/>
+        </w:rPr>
         <w:drawing>
-          <wp:inline xmlns:a="http://schemas.openxmlformats.org/drawingml/2006/main" xmlns:pic="http://schemas.openxmlformats.org/drawingml/2006/picture">
+          <wp:inline distT="0" distB="0" distL="0" distR="0" wp14:anchorId="09366933" wp14:editId="076E7A9C">
             <wp:extent cx="1270000" cy="1270000"/>
+            <wp:effectExtent l="0" t="0" r="0" b="0"/>
             <wp:docPr id="2" name="Picture 2"/>
             <wp:cNvGraphicFramePr>
-              <a:graphicFrameLocks noChangeAspect="1"/>
+              <a:graphicFrameLocks xmlns:a="http://schemas.openxmlformats.org/drawingml/2006/main" noChangeAspect="1"/>
             </wp:cNvGraphicFramePr>
-            <a:graphic>
+            <a:graphic xmlns:a="http://schemas.openxmlformats.org/drawingml/2006/main">
               <a:graphicData uri="http://schemas.openxmlformats.org/drawingml/2006/picture">
-                <pic:pic>
+                <pic:pic xmlns:pic="http://schemas.openxmlformats.org/drawingml/2006/picture">
                   <pic:nvPicPr>
                     <pic:cNvPr id="0" name="image.png"/>
                     <pic:cNvPicPr/>
                   </pic:nvPicPr>
                   <pic:blipFill>
-                    <a:blip r:embed="rId10"/>
+                    <a:blip r:embed="rId8"/>
                     <a:stretch>
                       <a:fillRect/>
                     </a:stretch>
@@ -416,7 +998,9 @@
                       <a:off x="0" y="0"/>
                       <a:ext cx="1270000" cy="1270000"/>
                     </a:xfrm>
-                    <a:prstGeom prst="rect"/>
+                    <a:prstGeom prst="rect">
+                      <a:avLst/>
+                    </a:prstGeom>
                   </pic:spPr>
                 </pic:pic>
               </a:graphicData>
@@ -427,15 +1011,12 @@
     </w:p>
     <w:p>
       <w:pPr>
-        <w:spacing w:line="240" w:lineRule="auto" w:before="120" w:after="280"/>
-        <w:ind w:left="0" w:right="0" w:firstLine="0"/>
+        <w:spacing w:before="120" w:after="280" w:line="240" w:lineRule="auto"/>
         <w:jc w:val="center"/>
       </w:pPr>
       <w:r>
         <w:rPr>
           <w:rFonts w:ascii="Times New Roman" w:hAnsi="Times New Roman"/>
-          <w:b w:val="0"/>
-          <w:i w:val="0"/>
           <w:color w:val="000000"/>
           <w:sz w:val="28"/>
         </w:rPr>
@@ -444,27 +1025,30 @@
     </w:p>
     <w:p>
       <w:pPr>
-        <w:spacing w:line="240" w:lineRule="auto" w:before="280" w:after="0"/>
-        <w:ind w:left="0" w:right="0" w:firstLine="0"/>
+        <w:spacing w:before="280" w:after="0" w:line="240" w:lineRule="auto"/>
         <w:jc w:val="center"/>
       </w:pPr>
       <w:r>
+        <w:rPr>
+          <w:noProof/>
+        </w:rPr>
         <w:drawing>
-          <wp:inline xmlns:a="http://schemas.openxmlformats.org/drawingml/2006/main" xmlns:pic="http://schemas.openxmlformats.org/drawingml/2006/picture">
+          <wp:inline distT="0" distB="0" distL="0" distR="0" wp14:anchorId="3462652D" wp14:editId="3DD03329">
             <wp:extent cx="1270000" cy="1270000"/>
+            <wp:effectExtent l="0" t="0" r="0" b="0"/>
             <wp:docPr id="1" name="Picture 1"/>
             <wp:cNvGraphicFramePr>
-              <a:graphicFrameLocks noChangeAspect="1"/>
+              <a:graphicFrameLocks xmlns:a="http://schemas.openxmlformats.org/drawingml/2006/main" noChangeAspect="1"/>
             </wp:cNvGraphicFramePr>
-            <a:graphic>
+            <a:graphic xmlns:a="http://schemas.openxmlformats.org/drawingml/2006/main">
               <a:graphicData uri="http://schemas.openxmlformats.org/drawingml/2006/picture">
-                <pic:pic>
+                <pic:pic xmlns:pic="http://schemas.openxmlformats.org/drawingml/2006/picture">
                   <pic:nvPicPr>
                     <pic:cNvPr id="0" name="image.png"/>
                     <pic:cNvPicPr/>
                   </pic:nvPicPr>
                   <pic:blipFill>
-                    <a:blip r:embed="rId10"/>
+                    <a:blip r:embed="rId8"/>
                     <a:stretch>
                       <a:fillRect/>
                     </a:stretch>
@@ -474,7 +1058,9 @@
                       <a:off x="0" y="0"/>
                       <a:ext cx="1270000" cy="1270000"/>
                     </a:xfrm>
-                    <a:prstGeom prst="rect"/>
+                    <a:prstGeom prst="rect">
+                      <a:avLst/>
+                    </a:prstGeom>
                   </pic:spPr>
                 </pic:pic>
               </a:graphicData>
@@ -485,49 +1071,69 @@
     </w:p>
     <w:p>
       <w:pPr>
-        <w:spacing w:line="240" w:lineRule="auto" w:before="120" w:after="280"/>
-        <w:ind w:left="0" w:right="0" w:firstLine="0"/>
+        <w:spacing w:before="120" w:after="280" w:line="240" w:lineRule="auto"/>
         <w:jc w:val="center"/>
-      </w:pPr>
-      <w:r>
-        <w:rPr>
-          <w:rFonts w:ascii="Times New Roman" w:hAnsi="Times New Roman"/>
-          <w:b w:val="0"/>
-          <w:i w:val="0"/>
-          <w:color w:val="000000"/>
-          <w:sz w:val="28"/>
+        <w:rPr>
+          <w:lang w:val="ru-RU"/>
+        </w:rPr>
+      </w:pPr>
+      <w:r>
+        <w:rPr>
+          <w:rFonts w:ascii="Times New Roman" w:hAnsi="Times New Roman"/>
+          <w:color w:val="000000"/>
+          <w:sz w:val="28"/>
+          <w:lang w:val="ru-RU"/>
         </w:rPr>
         <w:t>Рисунок 1.2 – Новое изображение</w:t>
       </w:r>
     </w:p>
     <w:p>
       <w:pPr>
-        <w:spacing w:line="240" w:lineRule="auto" w:before="0" w:after="0"/>
-        <w:ind w:left="0" w:right="0" w:firstLine="709"/>
+        <w:spacing w:after="0" w:line="240" w:lineRule="auto"/>
+        <w:ind w:firstLine="709"/>
         <w:jc w:val="both"/>
-      </w:pPr>
-      <w:r>
-        <w:rPr>
-          <w:rFonts w:ascii="Times New Roman" w:hAnsi="Times New Roman"/>
-          <w:b w:val="0"/>
-          <w:i w:val="0"/>
-          <w:color w:val="000000"/>
-          <w:sz w:val="28"/>
-        </w:rPr>
-        <w:t>dasda32132131231sd</w:t>
-      </w:r>
-    </w:p>
-    <w:p>
-      <w:pPr>
-        <w:spacing w:line="240" w:lineRule="auto" w:before="0" w:after="0"/>
-        <w:ind w:left="0" w:right="0" w:firstLine="709"/>
+        <w:rPr>
+          <w:lang w:val="ru-RU"/>
+        </w:rPr>
+      </w:pPr>
+      <w:r>
+        <w:rPr>
+          <w:rFonts w:ascii="Times New Roman" w:hAnsi="Times New Roman"/>
+          <w:color w:val="000000"/>
+          <w:sz w:val="28"/>
+        </w:rPr>
+        <w:t>dasda</w:t>
+      </w:r>
+      <w:r>
+        <w:rPr>
+          <w:rFonts w:ascii="Times New Roman" w:hAnsi="Times New Roman"/>
+          <w:color w:val="000000"/>
+          <w:sz w:val="28"/>
+          <w:lang w:val="ru-RU"/>
+        </w:rPr>
+        <w:t>32132131231</w:t>
+      </w:r>
+      <w:r>
+        <w:rPr>
+          <w:rFonts w:ascii="Times New Roman" w:hAnsi="Times New Roman"/>
+          <w:color w:val="000000"/>
+          <w:sz w:val="28"/>
+        </w:rPr>
+        <w:t>sd</w:t>
+      </w:r>
+    </w:p>
+    <w:p>
+      <w:pPr>
+        <w:spacing w:after="0" w:line="240" w:lineRule="auto"/>
+        <w:ind w:firstLine="709"/>
         <w:jc w:val="both"/>
-      </w:pPr>
-      <w:r>
-        <w:rPr>
-          <w:rFonts w:ascii="Times New Roman" w:hAnsi="Times New Roman"/>
-          <w:b w:val="0"/>
-          <w:i w:val="0"/>
+        <w:rPr>
+          <w:lang w:val="ru-RU"/>
+        </w:rPr>
+      </w:pPr>
+      <w:r>
+        <w:rPr>
+          <w:rFonts w:ascii="Times New Roman" w:hAnsi="Times New Roman"/>
           <w:color w:val="000000"/>
           <w:sz w:val="28"/>
         </w:rPr>
@@ -537,50 +1143,57 @@
     <w:p>
       <w:pPr>
         <w:pStyle w:val="2"/>
-        <w:spacing w:line="240" w:lineRule="auto" w:before="360" w:after="240"/>
-        <w:ind w:left="0" w:right="0" w:firstLine="709"/>
+        <w:spacing w:before="360" w:after="240" w:line="240" w:lineRule="auto"/>
+        <w:ind w:firstLine="709"/>
+        <w:rPr>
+          <w:lang w:val="ru-RU"/>
+        </w:rPr>
       </w:pPr>
       <w:r>
         <w:rPr>
           <w:rFonts w:ascii="Times New Roman" w:hAnsi="Times New Roman"/>
           <w:b/>
-          <w:i w:val="0"/>
-          <w:color w:val="000000"/>
-          <w:sz w:val="28"/>
+          <w:color w:val="000000"/>
+          <w:sz w:val="28"/>
+          <w:lang w:val="ru-RU"/>
         </w:rPr>
         <w:t>1.1 Новый222 заголовок</w:t>
       </w:r>
     </w:p>
     <w:p>
       <w:pPr>
-        <w:spacing w:line="240" w:lineRule="auto" w:before="0" w:after="0"/>
-        <w:ind w:left="0" w:right="0" w:firstLine="709"/>
+        <w:spacing w:after="0" w:line="240" w:lineRule="auto"/>
+        <w:ind w:firstLine="709"/>
         <w:jc w:val="both"/>
-      </w:pPr>
-      <w:r>
-        <w:rPr>
-          <w:rFonts w:ascii="Times New Roman" w:hAnsi="Times New Roman"/>
-          <w:b w:val="0"/>
-          <w:i w:val="0"/>
-          <w:color w:val="000000"/>
-          <w:sz w:val="28"/>
+        <w:rPr>
+          <w:lang w:val="ru-RU"/>
+        </w:rPr>
+      </w:pPr>
+      <w:r>
+        <w:rPr>
+          <w:rFonts w:ascii="Times New Roman" w:hAnsi="Times New Roman"/>
+          <w:color w:val="000000"/>
+          <w:sz w:val="28"/>
+          <w:lang w:val="ru-RU"/>
         </w:rPr>
         <w:t>2020220</w:t>
       </w:r>
     </w:p>
     <w:p>
       <w:pPr>
-        <w:spacing w:line="240" w:lineRule="auto" w:before="0" w:after="0"/>
-        <w:ind w:left="0" w:right="0" w:firstLine="709"/>
+        <w:spacing w:after="0" w:line="240" w:lineRule="auto"/>
+        <w:ind w:firstLine="709"/>
         <w:jc w:val="both"/>
-      </w:pPr>
-      <w:r>
-        <w:rPr>
-          <w:rFonts w:ascii="Times New Roman" w:hAnsi="Times New Roman"/>
-          <w:b w:val="0"/>
-          <w:i w:val="0"/>
-          <w:color w:val="000000"/>
-          <w:sz w:val="28"/>
+        <w:rPr>
+          <w:lang w:val="ru-RU"/>
+        </w:rPr>
+      </w:pPr>
+      <w:r>
+        <w:rPr>
+          <w:rFonts w:ascii="Times New Roman" w:hAnsi="Times New Roman"/>
+          <w:color w:val="000000"/>
+          <w:sz w:val="28"/>
+          <w:lang w:val="ru-RU"/>
         </w:rPr>
         <w:t>2020220323232</w:t>
       </w:r>
@@ -588,65 +1201,91 @@
     <w:p>
       <w:pPr>
         <w:pStyle w:val="3"/>
-        <w:spacing w:line="240" w:lineRule="auto" w:before="360" w:after="240"/>
-        <w:ind w:left="0" w:right="0" w:firstLine="709"/>
+        <w:spacing w:before="360" w:after="240" w:line="240" w:lineRule="auto"/>
+        <w:ind w:firstLine="709"/>
+        <w:rPr>
+          <w:lang w:val="ru-RU"/>
+        </w:rPr>
       </w:pPr>
       <w:r>
         <w:rPr>
           <w:rFonts w:ascii="Times New Roman" w:hAnsi="Times New Roman"/>
           <w:b/>
-          <w:i w:val="0"/>
-          <w:color w:val="000000"/>
-          <w:sz w:val="28"/>
+          <w:color w:val="000000"/>
+          <w:sz w:val="28"/>
+          <w:lang w:val="ru-RU"/>
         </w:rPr>
         <w:t>1.1.1 ну я хитрееее тебя 333проверка го гого</w:t>
       </w:r>
     </w:p>
     <w:p>
       <w:pPr>
-        <w:spacing w:line="240" w:lineRule="auto" w:before="0" w:after="0"/>
-        <w:ind w:left="0" w:right="0" w:firstLine="709"/>
+        <w:spacing w:after="0" w:line="240" w:lineRule="auto"/>
+        <w:ind w:firstLine="709"/>
         <w:jc w:val="both"/>
-      </w:pPr>
-      <w:r>
-        <w:rPr>
-          <w:rFonts w:ascii="Times New Roman" w:hAnsi="Times New Roman"/>
-          <w:b w:val="0"/>
-          <w:i w:val="0"/>
-          <w:color w:val="000000"/>
-          <w:sz w:val="28"/>
-        </w:rPr>
-        <w:t>[bnh эомент]</w:t>
+        <w:rPr>
+          <w:lang w:val="ru-RU"/>
+        </w:rPr>
+      </w:pPr>
+      <w:r>
+        <w:rPr>
+          <w:rFonts w:ascii="Times New Roman" w:hAnsi="Times New Roman"/>
+          <w:color w:val="000000"/>
+          <w:sz w:val="28"/>
+          <w:lang w:val="ru-RU"/>
+        </w:rPr>
+        <w:t>[</w:t>
+      </w:r>
+      <w:r>
+        <w:rPr>
+          <w:rFonts w:ascii="Times New Roman" w:hAnsi="Times New Roman"/>
+          <w:color w:val="000000"/>
+          <w:sz w:val="28"/>
+        </w:rPr>
+        <w:t>bnh</w:t>
+      </w:r>
+      <w:r>
+        <w:rPr>
+          <w:rFonts w:ascii="Times New Roman" w:hAnsi="Times New Roman"/>
+          <w:color w:val="000000"/>
+          <w:sz w:val="28"/>
+          <w:lang w:val="ru-RU"/>
+        </w:rPr>
+        <w:t xml:space="preserve"> эомент]</w:t>
       </w:r>
     </w:p>
     <w:p>
       <w:pPr>
         <w:pStyle w:val="2"/>
-        <w:spacing w:line="240" w:lineRule="auto" w:before="360" w:after="240"/>
-        <w:ind w:left="0" w:right="0" w:firstLine="709"/>
+        <w:spacing w:before="360" w:after="240" w:line="240" w:lineRule="auto"/>
+        <w:ind w:firstLine="709"/>
+        <w:rPr>
+          <w:lang w:val="ru-RU"/>
+        </w:rPr>
       </w:pPr>
       <w:r>
         <w:rPr>
           <w:rFonts w:ascii="Times New Roman" w:hAnsi="Times New Roman"/>
           <w:b/>
-          <w:i w:val="0"/>
-          <w:color w:val="000000"/>
-          <w:sz w:val="28"/>
+          <w:color w:val="000000"/>
+          <w:sz w:val="28"/>
+          <w:lang w:val="ru-RU"/>
         </w:rPr>
         <w:t>1.2 Ну если и это заголоовк мошны йто просто молчу</w:t>
       </w:r>
     </w:p>
     <w:p>
       <w:pPr>
-        <w:spacing w:line="240" w:lineRule="auto" w:before="0" w:after="0"/>
-        <w:ind w:left="0" w:right="0" w:firstLine="709"/>
+        <w:spacing w:after="0" w:line="240" w:lineRule="auto"/>
+        <w:ind w:firstLine="709"/>
         <w:jc w:val="both"/>
-      </w:pPr>
-      <w:r>
-        <w:rPr>
-          <w:rFonts w:ascii="Times New Roman" w:hAnsi="Times New Roman"/>
-          <w:b w:val="0"/>
-          <w:i w:val="0"/>
+        <w:rPr>
+          <w:lang w:val="ru-RU"/>
+        </w:rPr>
+      </w:pPr>
+      <w:r>
+        <w:rPr>
+          <w:rFonts w:ascii="Times New Roman" w:hAnsi="Times New Roman"/>
           <w:color w:val="000000"/>
           <w:sz w:val="28"/>
         </w:rPr>
@@ -655,65 +1294,85 @@
     </w:p>
     <w:p>
       <w:pPr>
-        <w:spacing w:line="240" w:lineRule="auto" w:before="0" w:after="0"/>
-        <w:ind w:left="0" w:right="0" w:firstLine="709"/>
+        <w:spacing w:after="0" w:line="240" w:lineRule="auto"/>
+        <w:ind w:firstLine="709"/>
         <w:jc w:val="both"/>
-      </w:pPr>
-      <w:r>
-        <w:rPr>
-          <w:rFonts w:ascii="Times New Roman" w:hAnsi="Times New Roman"/>
-          <w:b w:val="0"/>
-          <w:i w:val="0"/>
-          <w:color w:val="000000"/>
-          <w:sz w:val="28"/>
-        </w:rPr>
-        <w:t>pusin3</w:t>
-      </w:r>
-    </w:p>
-    <w:p>
-      <w:pPr>
-        <w:spacing w:line="240" w:lineRule="auto" w:before="0" w:after="0"/>
-        <w:ind w:left="0" w:right="0" w:firstLine="709"/>
+        <w:rPr>
+          <w:lang w:val="ru-RU"/>
+        </w:rPr>
+      </w:pPr>
+      <w:r>
+        <w:rPr>
+          <w:rFonts w:ascii="Times New Roman" w:hAnsi="Times New Roman"/>
+          <w:color w:val="000000"/>
+          <w:sz w:val="28"/>
+        </w:rPr>
+        <w:t>pusin</w:t>
+      </w:r>
+      <w:r>
+        <w:rPr>
+          <w:rFonts w:ascii="Times New Roman" w:hAnsi="Times New Roman"/>
+          <w:color w:val="000000"/>
+          <w:sz w:val="28"/>
+          <w:lang w:val="ru-RU"/>
+        </w:rPr>
+        <w:t>3</w:t>
+      </w:r>
+    </w:p>
+    <w:p>
+      <w:pPr>
+        <w:spacing w:after="0" w:line="240" w:lineRule="auto"/>
+        <w:ind w:firstLine="709"/>
         <w:jc w:val="both"/>
-      </w:pPr>
-      <w:r>
-        <w:rPr>
-          <w:rFonts w:ascii="Times New Roman" w:hAnsi="Times New Roman"/>
-          <w:b w:val="0"/>
-          <w:i w:val="0"/>
-          <w:color w:val="000000"/>
-          <w:sz w:val="28"/>
-        </w:rPr>
-        <w:t>pusin2</w:t>
+        <w:rPr>
+          <w:lang w:val="ru-RU"/>
+        </w:rPr>
+      </w:pPr>
+      <w:r>
+        <w:rPr>
+          <w:rFonts w:ascii="Times New Roman" w:hAnsi="Times New Roman"/>
+          <w:color w:val="000000"/>
+          <w:sz w:val="28"/>
+        </w:rPr>
+        <w:t>pusin</w:t>
+      </w:r>
+      <w:r>
+        <w:rPr>
+          <w:rFonts w:ascii="Times New Roman" w:hAnsi="Times New Roman"/>
+          <w:color w:val="000000"/>
+          <w:sz w:val="28"/>
+          <w:lang w:val="ru-RU"/>
+        </w:rPr>
+        <w:t>2</w:t>
       </w:r>
     </w:p>
     <w:p>
       <w:pPr>
         <w:pStyle w:val="2"/>
-        <w:spacing w:line="240" w:lineRule="auto" w:before="360" w:after="240"/>
-        <w:ind w:left="0" w:right="0" w:firstLine="709"/>
+        <w:spacing w:before="360" w:after="240" w:line="240" w:lineRule="auto"/>
+        <w:ind w:firstLine="709"/>
+        <w:rPr>
+          <w:lang w:val="ru-RU"/>
+        </w:rPr>
       </w:pPr>
       <w:r>
         <w:rPr>
           <w:rFonts w:ascii="Times New Roman" w:hAnsi="Times New Roman"/>
           <w:b/>
-          <w:i w:val="0"/>
-          <w:color w:val="000000"/>
-          <w:sz w:val="28"/>
+          <w:color w:val="000000"/>
+          <w:sz w:val="28"/>
+          <w:lang w:val="ru-RU"/>
         </w:rPr>
         <w:t>1.3 иди сюда заголовок 2</w:t>
       </w:r>
     </w:p>
     <w:p>
       <w:pPr>
-        <w:spacing w:line="240" w:lineRule="auto" w:before="280" w:after="0"/>
-        <w:ind w:left="0" w:right="0" w:firstLine="0"/>
-        <w:jc w:val="left"/>
-      </w:pPr>
-      <w:r>
-        <w:rPr>
-          <w:rFonts w:ascii="Times New Roman" w:hAnsi="Times New Roman"/>
-          <w:i w:val="0"/>
+        <w:spacing w:before="280" w:after="0" w:line="240" w:lineRule="auto"/>
+      </w:pPr>
+      <w:r>
+        <w:rPr>
+          <w:rFonts w:ascii="Times New Roman" w:hAnsi="Times New Roman"/>
           <w:color w:val="000000"/>
           <w:sz w:val="28"/>
         </w:rPr>
@@ -722,9 +1381,9 @@
     </w:p>
     <w:tbl>
       <w:tblPr>
-        <w:tblW w:type="auto" w:w="0"/>
+        <w:tblW w:w="0" w:type="auto"/>
         <w:tblLayout w:type="fixed"/>
-        <w:tblLook w:firstColumn="1" w:firstRow="1" w:lastColumn="0" w:lastRow="0" w:noHBand="0" w:noVBand="1" w:val="04A0"/>
+        <w:tblLook w:val="04A0" w:firstRow="1" w:lastRow="0" w:firstColumn="1" w:lastColumn="0" w:noHBand="0" w:noVBand="1"/>
       </w:tblPr>
       <w:tblGrid>
         <w:gridCol w:w="4680"/>
@@ -733,25 +1392,23 @@
       <w:tr>
         <w:tc>
           <w:tcPr>
-            <w:tcW w:type="dxa" w:w="4680"/>
-            <w:vAlign w:val="center"/>
+            <w:tcW w:w="4680" w:type="dxa"/>
             <w:tcBorders>
-              <w:top w:val="single" w:sz="4" w:color="000000"/>
-              <w:left w:val="single" w:sz="4" w:color="000000"/>
-              <w:bottom w:val="single" w:sz="4" w:color="000000"/>
-              <w:right w:val="single" w:sz="4" w:color="000000"/>
+              <w:top w:val="single" w:sz="4" w:space="0" w:color="000000"/>
+              <w:left w:val="single" w:sz="4" w:space="0" w:color="000000"/>
+              <w:bottom w:val="single" w:sz="4" w:space="0" w:color="000000"/>
+              <w:right w:val="single" w:sz="4" w:space="0" w:color="000000"/>
             </w:tcBorders>
-          </w:tcPr>
-          <w:p>
-            <w:pPr>
-              <w:spacing w:line="240" w:lineRule="auto" w:before="0" w:after="0"/>
-              <w:ind w:left="0" w:right="0" w:firstLine="0"/>
+            <w:vAlign w:val="center"/>
+          </w:tcPr>
+          <w:p>
+            <w:pPr>
+              <w:spacing w:after="0" w:line="240" w:lineRule="auto"/>
               <w:jc w:val="center"/>
             </w:pPr>
             <w:r>
               <w:rPr>
                 <w:rFonts w:ascii="Times New Roman" w:hAnsi="Times New Roman"/>
-                <w:i w:val="0"/>
                 <w:color w:val="00FF00"/>
                 <w:sz w:val="24"/>
               </w:rPr>
@@ -761,25 +1418,23 @@
         </w:tc>
         <w:tc>
           <w:tcPr>
-            <w:tcW w:type="dxa" w:w="4680"/>
-            <w:vAlign w:val="center"/>
+            <w:tcW w:w="4680" w:type="dxa"/>
             <w:tcBorders>
-              <w:top w:val="single" w:sz="4" w:color="000000"/>
-              <w:left w:val="single" w:sz="4" w:color="000000"/>
-              <w:bottom w:val="single" w:sz="4" w:color="000000"/>
-              <w:right w:val="single" w:sz="4" w:color="000000"/>
+              <w:top w:val="single" w:sz="4" w:space="0" w:color="000000"/>
+              <w:left w:val="single" w:sz="4" w:space="0" w:color="000000"/>
+              <w:bottom w:val="single" w:sz="4" w:space="0" w:color="000000"/>
+              <w:right w:val="single" w:sz="4" w:space="0" w:color="000000"/>
             </w:tcBorders>
-          </w:tcPr>
-          <w:p>
-            <w:pPr>
-              <w:spacing w:line="240" w:lineRule="auto" w:before="0" w:after="0"/>
-              <w:ind w:left="0" w:right="0" w:firstLine="0"/>
+            <w:vAlign w:val="center"/>
+          </w:tcPr>
+          <w:p>
+            <w:pPr>
+              <w:spacing w:after="0" w:line="240" w:lineRule="auto"/>
               <w:jc w:val="center"/>
             </w:pPr>
             <w:r>
               <w:rPr>
                 <w:rFonts w:ascii="Times New Roman" w:hAnsi="Times New Roman"/>
-                <w:i w:val="0"/>
                 <w:color w:val="00FF00"/>
                 <w:sz w:val="24"/>
               </w:rPr>
@@ -791,25 +1446,23 @@
       <w:tr>
         <w:tc>
           <w:tcPr>
-            <w:tcW w:type="dxa" w:w="4680"/>
-            <w:vAlign w:val="center"/>
+            <w:tcW w:w="4680" w:type="dxa"/>
             <w:tcBorders>
-              <w:top w:val="single" w:sz="4" w:color="000000"/>
-              <w:left w:val="single" w:sz="4" w:color="000000"/>
-              <w:bottom w:val="single" w:sz="4" w:color="000000"/>
-              <w:right w:val="single" w:sz="4" w:color="000000"/>
+              <w:top w:val="single" w:sz="4" w:space="0" w:color="000000"/>
+              <w:left w:val="single" w:sz="4" w:space="0" w:color="000000"/>
+              <w:bottom w:val="single" w:sz="4" w:space="0" w:color="000000"/>
+              <w:right w:val="single" w:sz="4" w:space="0" w:color="000000"/>
             </w:tcBorders>
-          </w:tcPr>
-          <w:p>
-            <w:pPr>
-              <w:spacing w:line="240" w:lineRule="auto" w:before="0" w:after="0"/>
-              <w:ind w:left="0" w:right="0" w:firstLine="0"/>
+            <w:vAlign w:val="center"/>
+          </w:tcPr>
+          <w:p>
+            <w:pPr>
+              <w:spacing w:after="0" w:line="240" w:lineRule="auto"/>
               <w:jc w:val="center"/>
             </w:pPr>
             <w:r>
               <w:rPr>
                 <w:rFonts w:ascii="Times New Roman" w:hAnsi="Times New Roman"/>
-                <w:i w:val="0"/>
                 <w:color w:val="00FF00"/>
                 <w:sz w:val="24"/>
               </w:rPr>
@@ -819,25 +1472,23 @@
         </w:tc>
         <w:tc>
           <w:tcPr>
-            <w:tcW w:type="dxa" w:w="4680"/>
-            <w:vAlign w:val="center"/>
+            <w:tcW w:w="4680" w:type="dxa"/>
             <w:tcBorders>
-              <w:top w:val="single" w:sz="4" w:color="000000"/>
-              <w:left w:val="single" w:sz="4" w:color="000000"/>
-              <w:bottom w:val="single" w:sz="4" w:color="000000"/>
-              <w:right w:val="single" w:sz="4" w:color="000000"/>
+              <w:top w:val="single" w:sz="4" w:space="0" w:color="000000"/>
+              <w:left w:val="single" w:sz="4" w:space="0" w:color="000000"/>
+              <w:bottom w:val="single" w:sz="4" w:space="0" w:color="000000"/>
+              <w:right w:val="single" w:sz="4" w:space="0" w:color="000000"/>
             </w:tcBorders>
-          </w:tcPr>
-          <w:p>
-            <w:pPr>
-              <w:spacing w:line="240" w:lineRule="auto" w:before="0" w:after="0"/>
-              <w:ind w:left="0" w:right="0" w:firstLine="0"/>
+            <w:vAlign w:val="center"/>
+          </w:tcPr>
+          <w:p>
+            <w:pPr>
+              <w:spacing w:after="0" w:line="240" w:lineRule="auto"/>
               <w:jc w:val="center"/>
             </w:pPr>
             <w:r>
               <w:rPr>
                 <w:rFonts w:ascii="Times New Roman" w:hAnsi="Times New Roman"/>
-                <w:i w:val="0"/>
                 <w:color w:val="00FF00"/>
                 <w:sz w:val="24"/>
               </w:rPr>
@@ -849,15 +1500,13 @@
     </w:tbl>
     <w:p>
       <w:pPr>
-        <w:spacing w:line="240" w:lineRule="auto" w:before="0" w:after="0"/>
-        <w:ind w:left="0" w:right="0" w:firstLine="709"/>
+        <w:spacing w:after="0" w:line="240" w:lineRule="auto"/>
+        <w:ind w:firstLine="709"/>
         <w:jc w:val="both"/>
       </w:pPr>
       <w:r>
         <w:rPr>
           <w:rFonts w:ascii="Times New Roman" w:hAnsi="Times New Roman"/>
-          <w:b w:val="0"/>
-          <w:i w:val="0"/>
           <w:color w:val="000000"/>
           <w:sz w:val="28"/>
         </w:rPr>
@@ -866,20 +1515,17 @@
     </w:p>
     <w:p>
       <w:pPr>
-        <w:spacing w:line="240" w:lineRule="auto" w:before="280" w:after="0"/>
-        <w:ind w:left="0" w:right="0" w:firstLine="0"/>
         <w:pBdr>
           <w:top w:val="single" w:sz="4" w:space="4" w:color="000000"/>
           <w:left w:val="single" w:sz="4" w:space="4" w:color="000000"/>
           <w:bottom w:val="single" w:sz="4" w:space="4" w:color="000000"/>
           <w:right w:val="single" w:sz="4" w:space="4" w:color="000000"/>
         </w:pBdr>
+        <w:spacing w:before="280" w:after="0" w:line="240" w:lineRule="auto"/>
       </w:pPr>
       <w:r>
         <w:rPr>
           <w:rFonts w:ascii="Courier New" w:hAnsi="Courier New"/>
-          <w:b w:val="0"/>
-          <w:i w:val="0"/>
           <w:color w:val="000000"/>
           <w:sz w:val="24"/>
         </w:rPr>
@@ -888,15 +1534,12 @@
     </w:p>
     <w:p>
       <w:pPr>
-        <w:spacing w:line="240" w:lineRule="auto" w:before="120" w:after="280"/>
-        <w:ind w:left="0" w:right="0" w:firstLine="0"/>
+        <w:spacing w:before="120" w:after="280" w:line="240" w:lineRule="auto"/>
         <w:jc w:val="center"/>
       </w:pPr>
       <w:r>
         <w:rPr>
           <w:rFonts w:ascii="Times New Roman" w:hAnsi="Times New Roman"/>
-          <w:b w:val="0"/>
-          <w:i w:val="0"/>
           <w:color w:val="000000"/>
           <w:sz w:val="28"/>
         </w:rPr>
@@ -905,15 +1548,13 @@
     </w:p>
     <w:p>
       <w:pPr>
-        <w:spacing w:line="240" w:lineRule="auto" w:before="0" w:after="0"/>
-        <w:ind w:left="0" w:right="0" w:firstLine="709"/>
+        <w:spacing w:after="0" w:line="240" w:lineRule="auto"/>
+        <w:ind w:firstLine="709"/>
         <w:jc w:val="both"/>
       </w:pPr>
       <w:r>
         <w:rPr>
           <w:rFonts w:ascii="Times New Roman" w:hAnsi="Times New Roman"/>
-          <w:b w:val="0"/>
-          <w:i w:val="0"/>
           <w:color w:val="000000"/>
           <w:sz w:val="28"/>
         </w:rPr>
@@ -922,126 +1563,200 @@
     </w:p>
     <w:p>
       <w:pPr>
-        <w:spacing w:line="240" w:lineRule="auto" w:before="0" w:after="0"/>
-        <w:ind w:left="0" w:right="0" w:firstLine="709"/>
+        <w:spacing w:after="0" w:line="240" w:lineRule="auto"/>
+        <w:ind w:firstLine="709"/>
         <w:jc w:val="both"/>
-      </w:pPr>
-      <w:r>
-        <w:rPr>
-          <w:rFonts w:ascii="Times New Roman" w:hAnsi="Times New Roman"/>
-          <w:b w:val="0"/>
-          <w:i w:val="0"/>
-          <w:color w:val="000000"/>
-          <w:sz w:val="28"/>
-        </w:rPr>
-        <w:t>но вот и все par updated</w:t>
+        <w:rPr>
+          <w:lang w:val="ru-RU"/>
+        </w:rPr>
+      </w:pPr>
+      <w:r>
+        <w:rPr>
+          <w:rFonts w:ascii="Times New Roman" w:hAnsi="Times New Roman"/>
+          <w:color w:val="000000"/>
+          <w:sz w:val="28"/>
+          <w:lang w:val="ru-RU"/>
+        </w:rPr>
+        <w:t xml:space="preserve">но вот и все </w:t>
+      </w:r>
+      <w:r>
+        <w:rPr>
+          <w:rFonts w:ascii="Times New Roman" w:hAnsi="Times New Roman"/>
+          <w:color w:val="000000"/>
+          <w:sz w:val="28"/>
+        </w:rPr>
+        <w:t>par</w:t>
+      </w:r>
+      <w:r>
+        <w:rPr>
+          <w:rFonts w:ascii="Times New Roman" w:hAnsi="Times New Roman"/>
+          <w:color w:val="000000"/>
+          <w:sz w:val="28"/>
+          <w:lang w:val="ru-RU"/>
+        </w:rPr>
+        <w:t xml:space="preserve"> </w:t>
+      </w:r>
+      <w:r>
+        <w:rPr>
+          <w:rFonts w:ascii="Times New Roman" w:hAnsi="Times New Roman"/>
+          <w:color w:val="000000"/>
+          <w:sz w:val="28"/>
+        </w:rPr>
+        <w:t>updated</w:t>
       </w:r>
     </w:p>
     <w:tbl>
       <w:tblPr>
-        <w:tblW w:type="auto" w:w="0"/>
+        <w:tblW w:w="0" w:type="auto"/>
         <w:tblLayout w:type="fixed"/>
-        <w:tblLook w:firstColumn="1" w:firstRow="1" w:lastColumn="0" w:lastRow="0" w:noHBand="0" w:noVBand="1" w:val="04A0"/>
+        <w:tblLook w:val="04A0" w:firstRow="1" w:lastRow="0" w:firstColumn="1" w:lastColumn="0" w:noHBand="0" w:noVBand="1"/>
       </w:tblPr>
       <w:tblGrid>
-        <w:gridCol w:w="3120"/>
-        <w:gridCol w:w="3120"/>
-        <w:gridCol w:w="3120"/>
+        <w:gridCol w:w="936"/>
+        <w:gridCol w:w="7488"/>
+        <w:gridCol w:w="936"/>
       </w:tblGrid>
       <w:tr>
         <w:tc>
           <w:tcPr>
-            <w:tcW w:type="dxa" w:w="936"/>
-          </w:tcPr>
-          <w:p/>
-        </w:tc>
-        <w:tc>
-          <w:tcPr>
-            <w:tcW w:type="dxa" w:w="7488"/>
-            <w:vAlign w:val="center"/>
-          </w:tcPr>
-          <w:p>
-            <w:pPr>
-              <w:spacing w:line="240" w:lineRule="auto" w:before="240" w:after="240"/>
-              <w:ind w:left="0" w:right="0" w:firstLine="0"/>
-              <w:jc w:val="center"/>
-            </w:pPr>
-            <w:r>
-              <w:rPr>
-                <w:b w:val="0"/>
-                <w:i w:val="0"/>
-                <w:color w:val="000000"/>
-                <w:sz w:val="28"/>
-              </w:rPr>
-              <m:oMath xmlns:mml="http://www.w3.org/1998/Math/MathML">
+            <w:tcW w:w="936" w:type="dxa"/>
+          </w:tcPr>
+          <w:p>
+            <w:pPr>
+              <w:rPr>
+                <w:lang w:val="ru-RU"/>
+              </w:rPr>
+            </w:pPr>
+          </w:p>
+        </w:tc>
+        <w:tc>
+          <w:tcPr>
+            <w:tcW w:w="7488" w:type="dxa"/>
+            <w:vAlign w:val="center"/>
+          </w:tcPr>
+          <w:p>
+            <w:pPr>
+              <w:spacing w:before="240" w:after="240" w:line="240" w:lineRule="auto"/>
+              <w:jc w:val="center"/>
+            </w:pPr>
+            <m:oMathPara>
+              <m:oMath>
                 <m:r>
+                  <w:rPr>
+                    <w:rFonts w:ascii="Cambria Math" w:hAnsi="Cambria Math"/>
+                    <w:color w:val="000000"/>
+                    <w:sz w:val="28"/>
+                  </w:rPr>
                   <m:t>E=2332m</m:t>
                 </m:r>
                 <m:sSup>
+                  <m:sSupPr>
+                    <m:ctrlPr>
+                      <w:rPr>
+                        <w:rFonts w:ascii="Cambria Math" w:hAnsi="Cambria Math"/>
+                      </w:rPr>
+                    </m:ctrlPr>
+                  </m:sSupPr>
                   <m:e>
                     <m:r>
+                      <w:rPr>
+                        <w:rFonts w:ascii="Cambria Math" w:hAnsi="Cambria Math"/>
+                      </w:rPr>
                       <m:t>c</m:t>
                     </m:r>
                   </m:e>
                   <m:sup>
                     <m:r>
+                      <w:rPr>
+                        <w:rFonts w:ascii="Cambria Math" w:hAnsi="Cambria Math"/>
+                      </w:rPr>
                       <m:t>2</m:t>
                     </m:r>
                   </m:sup>
                 </m:sSup>
-              </m:oMath>
-              <m:oMath xmlns:mml="http://www.w3.org/1998/Math/MathML">
                 <m:f>
                   <m:fPr>
-                    <m:type m:val="bar"/>
+                    <m:ctrlPr>
+                      <w:rPr>
+                        <w:rFonts w:ascii="Cambria Math" w:hAnsi="Cambria Math"/>
+                      </w:rPr>
+                    </m:ctrlPr>
                   </m:fPr>
                   <m:num>
                     <m:r>
+                      <w:rPr>
+                        <w:rFonts w:ascii="Cambria Math" w:hAnsi="Cambria Math"/>
+                      </w:rPr>
                       <m:t>1</m:t>
                     </m:r>
                   </m:num>
                   <m:den>
                     <m:r>
+                      <w:rPr>
+                        <w:rFonts w:ascii="Cambria Math" w:hAnsi="Cambria Math"/>
+                      </w:rPr>
                       <m:t>2</m:t>
                     </m:r>
                   </m:den>
                 </m:f>
                 <m:r>
-                  <m:t>−</m:t>
+                  <w:rPr>
+                    <w:rFonts w:ascii="Cambria Math" w:hAnsi="Cambria Math"/>
+                  </w:rPr>
+                  <m:t>-</m:t>
                 </m:r>
                 <m:f>
                   <m:fPr>
-                    <m:type m:val="bar"/>
+                    <m:ctrlPr>
+                      <w:rPr>
+                        <w:rFonts w:ascii="Cambria Math" w:hAnsi="Cambria Math"/>
+                      </w:rPr>
+                    </m:ctrlPr>
                   </m:fPr>
                   <m:num>
                     <m:f>
                       <m:fPr>
-                        <m:type m:val="bar"/>
+                        <m:ctrlPr>
+                          <w:rPr>
+                            <w:rFonts w:ascii="Cambria Math" w:hAnsi="Cambria Math"/>
+                          </w:rPr>
+                        </m:ctrlPr>
                       </m:fPr>
                       <m:num>
                         <m:r>
+                          <w:rPr>
+                            <w:rFonts w:ascii="Cambria Math" w:hAnsi="Cambria Math"/>
+                          </w:rPr>
                           <m:t>10</m:t>
                         </m:r>
                       </m:num>
                       <m:den>
                         <m:r>
+                          <w:rPr>
+                            <w:rFonts w:ascii="Cambria Math" w:hAnsi="Cambria Math"/>
+                          </w:rPr>
                           <m:t>20</m:t>
                         </m:r>
                       </m:den>
                     </m:f>
                     <m:r>
-                      <m:t>−</m:t>
+                      <w:rPr>
+                        <w:rFonts w:ascii="Cambria Math" w:hAnsi="Cambria Math"/>
+                      </w:rPr>
+                      <m:t>-</m:t>
                     </m:r>
                   </m:num>
                   <m:den/>
                 </m:f>
                 <m:r>
+                  <w:rPr>
+                    <w:rFonts w:ascii="Cambria Math" w:hAnsi="Cambria Math"/>
+                  </w:rPr>
                   <m:t>=30[</m:t>
                 </m:r>
                 <m:m>
                   <m:mPr>
-                    <m:baseJc m:val="center"/>
-                    <m:plcHide m:val="on"/>
+                    <m:plcHide m:val="1"/>
                     <m:mcs>
                       <m:mc>
                         <m:mcPr>
@@ -1050,20 +1765,34 @@
                         </m:mcPr>
                       </m:mc>
                     </m:mcs>
+                    <m:ctrlPr>
+                      <w:rPr>
+                        <w:rFonts w:ascii="Cambria Math" w:hAnsi="Cambria Math"/>
+                      </w:rPr>
+                    </m:ctrlPr>
                   </m:mPr>
                   <m:mr>
                     <m:e>
                       <m:r>
+                        <w:rPr>
+                          <w:rFonts w:ascii="Cambria Math" w:hAnsi="Cambria Math"/>
+                        </w:rPr>
                         <m:t>1</m:t>
                       </m:r>
                     </m:e>
                     <m:e>
                       <m:r>
+                        <w:rPr>
+                          <w:rFonts w:ascii="Cambria Math" w:hAnsi="Cambria Math"/>
+                        </w:rPr>
                         <m:t>1</m:t>
                       </m:r>
                     </m:e>
                     <m:e>
                       <m:r>
+                        <w:rPr>
+                          <w:rFonts w:ascii="Cambria Math" w:hAnsi="Cambria Math"/>
+                        </w:rPr>
                         <m:t>11</m:t>
                       </m:r>
                     </m:e>
@@ -1071,16 +1800,25 @@
                   <m:mr>
                     <m:e>
                       <m:r>
+                        <w:rPr>
+                          <w:rFonts w:ascii="Cambria Math" w:hAnsi="Cambria Math"/>
+                        </w:rPr>
                         <m:t>1</m:t>
                       </m:r>
                     </m:e>
                     <m:e>
                       <m:r>
+                        <w:rPr>
+                          <w:rFonts w:ascii="Cambria Math" w:hAnsi="Cambria Math"/>
+                        </w:rPr>
                         <m:t>1</m:t>
                       </m:r>
                     </m:e>
                     <m:e>
                       <m:r>
+                        <w:rPr>
+                          <w:rFonts w:ascii="Cambria Math" w:hAnsi="Cambria Math"/>
+                        </w:rPr>
                         <m:t>11</m:t>
                       </m:r>
                     </m:e>
@@ -1088,44 +1826,53 @@
                   <m:mr>
                     <m:e>
                       <m:r>
+                        <w:rPr>
+                          <w:rFonts w:ascii="Cambria Math" w:hAnsi="Cambria Math"/>
+                        </w:rPr>
                         <m:t>1</m:t>
                       </m:r>
                     </m:e>
                     <m:e>
                       <m:r>
+                        <w:rPr>
+                          <w:rFonts w:ascii="Cambria Math" w:hAnsi="Cambria Math"/>
+                        </w:rPr>
                         <m:t>1</m:t>
                       </m:r>
                     </m:e>
                     <m:e>
                       <m:r>
+                        <w:rPr>
+                          <w:rFonts w:ascii="Cambria Math" w:hAnsi="Cambria Math"/>
+                        </w:rPr>
                         <m:t>11</m:t>
                       </m:r>
                     </m:e>
                   </m:mr>
                 </m:m>
                 <m:r>
+                  <w:rPr>
+                    <w:rFonts w:ascii="Cambria Math" w:hAnsi="Cambria Math"/>
+                  </w:rPr>
                   <m:t>]</m:t>
                 </m:r>
               </m:oMath>
-            </w:r>
-          </w:p>
-        </w:tc>
-        <w:tc>
-          <w:tcPr>
-            <w:tcW w:type="dxa" w:w="936"/>
-            <w:vAlign w:val="center"/>
-          </w:tcPr>
-          <w:p>
-            <w:pPr>
-              <w:spacing w:line="240" w:lineRule="auto" w:before="240" w:after="240"/>
-              <w:ind w:left="0" w:right="0" w:firstLine="0"/>
+            </m:oMathPara>
+          </w:p>
+        </w:tc>
+        <w:tc>
+          <w:tcPr>
+            <w:tcW w:w="936" w:type="dxa"/>
+            <w:vAlign w:val="center"/>
+          </w:tcPr>
+          <w:p>
+            <w:pPr>
+              <w:spacing w:before="240" w:after="240" w:line="240" w:lineRule="auto"/>
               <w:jc w:val="right"/>
             </w:pPr>
             <w:r>
               <w:rPr>
                 <w:rFonts w:ascii="Times New Roman" w:hAnsi="Times New Roman"/>
-                <w:b w:val="0"/>
-                <w:i w:val="0"/>
                 <w:color w:val="000000"/>
                 <w:sz w:val="28"/>
               </w:rPr>
@@ -1137,15 +1884,13 @@
     </w:tbl>
     <w:p>
       <w:pPr>
-        <w:spacing w:line="240" w:lineRule="auto" w:before="0" w:after="0"/>
-        <w:ind w:left="0" w:right="0" w:firstLine="709"/>
+        <w:spacing w:after="0" w:line="240" w:lineRule="auto"/>
+        <w:ind w:firstLine="709"/>
         <w:jc w:val="both"/>
       </w:pPr>
       <w:r>
         <w:rPr>
           <w:rFonts w:ascii="Times New Roman" w:hAnsi="Times New Roman"/>
-          <w:b w:val="0"/>
-          <w:i w:val="0"/>
           <w:color w:val="000000"/>
           <w:sz w:val="28"/>
         </w:rPr>
@@ -1154,27 +1899,30 @@
     </w:p>
     <w:p>
       <w:pPr>
-        <w:spacing w:line="240" w:lineRule="auto" w:before="280" w:after="0"/>
-        <w:ind w:left="0" w:right="0" w:firstLine="0"/>
+        <w:spacing w:before="280" w:after="0" w:line="240" w:lineRule="auto"/>
         <w:jc w:val="center"/>
       </w:pPr>
       <w:r>
+        <w:rPr>
+          <w:noProof/>
+        </w:rPr>
         <w:drawing>
-          <wp:inline xmlns:a="http://schemas.openxmlformats.org/drawingml/2006/main" xmlns:pic="http://schemas.openxmlformats.org/drawingml/2006/picture">
+          <wp:inline distT="0" distB="0" distL="0" distR="0" wp14:anchorId="77476E21" wp14:editId="0A58D7B6">
             <wp:extent cx="1270000" cy="1270000"/>
+            <wp:effectExtent l="0" t="0" r="0" b="0"/>
             <wp:docPr id="3" name="Picture 3"/>
             <wp:cNvGraphicFramePr>
-              <a:graphicFrameLocks noChangeAspect="1"/>
+              <a:graphicFrameLocks xmlns:a="http://schemas.openxmlformats.org/drawingml/2006/main" noChangeAspect="1"/>
             </wp:cNvGraphicFramePr>
-            <a:graphic>
+            <a:graphic xmlns:a="http://schemas.openxmlformats.org/drawingml/2006/main">
               <a:graphicData uri="http://schemas.openxmlformats.org/drawingml/2006/picture">
-                <pic:pic>
+                <pic:pic xmlns:pic="http://schemas.openxmlformats.org/drawingml/2006/picture">
                   <pic:nvPicPr>
                     <pic:cNvPr id="0" name="image.png"/>
                     <pic:cNvPicPr/>
                   </pic:nvPicPr>
                   <pic:blipFill>
-                    <a:blip r:embed="rId11"/>
+                    <a:blip r:embed="rId9"/>
                     <a:stretch>
                       <a:fillRect/>
                     </a:stretch>
@@ -1184,7 +1932,9 @@
                       <a:off x="0" y="0"/>
                       <a:ext cx="1270000" cy="1270000"/>
                     </a:xfrm>
-                    <a:prstGeom prst="rect"/>
+                    <a:prstGeom prst="rect">
+                      <a:avLst/>
+                    </a:prstGeom>
                   </pic:spPr>
                 </pic:pic>
               </a:graphicData>
@@ -1195,15 +1945,12 @@
     </w:p>
     <w:p>
       <w:pPr>
-        <w:spacing w:line="240" w:lineRule="auto" w:before="120" w:after="280"/>
-        <w:ind w:left="0" w:right="0" w:firstLine="0"/>
+        <w:spacing w:before="120" w:after="280" w:line="240" w:lineRule="auto"/>
         <w:jc w:val="center"/>
       </w:pPr>
       <w:r>
         <w:rPr>
           <w:rFonts w:ascii="Times New Roman" w:hAnsi="Times New Roman"/>
-          <w:b w:val="0"/>
-          <w:i w:val="0"/>
           <w:color w:val="000000"/>
           <w:sz w:val="28"/>
         </w:rPr>
@@ -1212,76 +1959,84 @@
     </w:p>
     <w:tbl>
       <w:tblPr>
-        <w:tblW w:type="auto" w:w="0"/>
+        <w:tblW w:w="0" w:type="auto"/>
         <w:tblLayout w:type="fixed"/>
-        <w:tblLook w:firstColumn="1" w:firstRow="1" w:lastColumn="0" w:lastRow="0" w:noHBand="0" w:noVBand="1" w:val="04A0"/>
+        <w:tblLook w:val="04A0" w:firstRow="1" w:lastRow="0" w:firstColumn="1" w:lastColumn="0" w:noHBand="0" w:noVBand="1"/>
       </w:tblPr>
       <w:tblGrid>
-        <w:gridCol w:w="3120"/>
-        <w:gridCol w:w="3120"/>
-        <w:gridCol w:w="3120"/>
+        <w:gridCol w:w="936"/>
+        <w:gridCol w:w="7488"/>
+        <w:gridCol w:w="936"/>
       </w:tblGrid>
       <w:tr>
         <w:tc>
           <w:tcPr>
-            <w:tcW w:type="dxa" w:w="936"/>
+            <w:tcW w:w="936" w:type="dxa"/>
           </w:tcPr>
           <w:p/>
         </w:tc>
         <w:tc>
           <w:tcPr>
-            <w:tcW w:type="dxa" w:w="7488"/>
-            <w:vAlign w:val="center"/>
-          </w:tcPr>
-          <w:p>
-            <w:pPr>
-              <w:spacing w:line="240" w:lineRule="auto" w:before="240" w:after="240"/>
-              <w:ind w:left="0" w:right="0" w:firstLine="0"/>
-              <w:jc w:val="center"/>
-            </w:pPr>
-            <w:r>
-              <w:rPr>
-                <w:b w:val="0"/>
-                <w:i w:val="0"/>
-                <w:color w:val="000000"/>
-                <w:sz w:val="28"/>
-              </w:rPr>
-              <m:oMath xmlns:mml="http://www.w3.org/1998/Math/MathML">
+            <w:tcW w:w="7488" w:type="dxa"/>
+            <w:vAlign w:val="center"/>
+          </w:tcPr>
+          <w:p>
+            <w:pPr>
+              <w:spacing w:before="240" w:after="240" w:line="240" w:lineRule="auto"/>
+              <w:jc w:val="center"/>
+            </w:pPr>
+            <m:oMathPara>
+              <m:oMath>
                 <m:r>
+                  <w:rPr>
+                    <w:rFonts w:ascii="Cambria Math" w:hAnsi="Cambria Math"/>
+                    <w:color w:val="000000"/>
+                    <w:sz w:val="28"/>
+                  </w:rPr>
                   <m:t>E=233d2m</m:t>
                 </m:r>
                 <m:sSup>
+                  <m:sSupPr>
+                    <m:ctrlPr>
+                      <w:rPr>
+                        <w:rFonts w:ascii="Cambria Math" w:hAnsi="Cambria Math"/>
+                      </w:rPr>
+                    </m:ctrlPr>
+                  </m:sSupPr>
                   <m:e>
                     <m:r>
+                      <w:rPr>
+                        <w:rFonts w:ascii="Cambria Math" w:hAnsi="Cambria Math"/>
+                      </w:rPr>
                       <m:t>c</m:t>
                     </m:r>
                   </m:e>
                   <m:sup>
                     <m:r>
+                      <w:rPr>
+                        <w:rFonts w:ascii="Cambria Math" w:hAnsi="Cambria Math"/>
+                      </w:rPr>
                       <m:t>2</m:t>
                     </m:r>
                   </m:sup>
                 </m:sSup>
               </m:oMath>
-            </w:r>
-          </w:p>
-        </w:tc>
-        <w:tc>
-          <w:tcPr>
-            <w:tcW w:type="dxa" w:w="936"/>
-            <w:vAlign w:val="center"/>
-          </w:tcPr>
-          <w:p>
-            <w:pPr>
-              <w:spacing w:line="240" w:lineRule="auto" w:before="240" w:after="240"/>
-              <w:ind w:left="0" w:right="0" w:firstLine="0"/>
+            </m:oMathPara>
+          </w:p>
+        </w:tc>
+        <w:tc>
+          <w:tcPr>
+            <w:tcW w:w="936" w:type="dxa"/>
+            <w:vAlign w:val="center"/>
+          </w:tcPr>
+          <w:p>
+            <w:pPr>
+              <w:spacing w:before="240" w:after="240" w:line="240" w:lineRule="auto"/>
               <w:jc w:val="right"/>
             </w:pPr>
             <w:r>
               <w:rPr>
                 <w:rFonts w:ascii="Times New Roman" w:hAnsi="Times New Roman"/>
-                <w:b w:val="0"/>
-                <w:i w:val="0"/>
                 <w:color w:val="000000"/>
                 <w:sz w:val="28"/>
               </w:rPr>
@@ -1294,14 +2049,13 @@
     <w:p>
       <w:pPr>
         <w:pStyle w:val="3"/>
-        <w:spacing w:line="240" w:lineRule="auto" w:before="360" w:after="240"/>
-        <w:ind w:left="0" w:right="0" w:firstLine="709"/>
+        <w:spacing w:before="360" w:after="240" w:line="240" w:lineRule="auto"/>
+        <w:ind w:firstLine="709"/>
       </w:pPr>
       <w:r>
         <w:rPr>
           <w:rFonts w:ascii="Times New Roman" w:hAnsi="Times New Roman"/>
           <w:b/>
-          <w:i w:val="0"/>
           <w:color w:val="000000"/>
           <w:sz w:val="28"/>
         </w:rPr>
@@ -1310,15 +2064,13 @@
     </w:p>
     <w:p>
       <w:pPr>
-        <w:spacing w:line="240" w:lineRule="auto" w:before="0" w:after="0"/>
-        <w:ind w:left="0" w:right="0" w:firstLine="709"/>
+        <w:spacing w:after="0" w:line="240" w:lineRule="auto"/>
+        <w:ind w:firstLine="709"/>
         <w:jc w:val="both"/>
       </w:pPr>
       <w:r>
         <w:rPr>
           <w:rFonts w:ascii="Times New Roman" w:hAnsi="Times New Roman"/>
-          <w:b w:val="0"/>
-          <w:i w:val="0"/>
           <w:color w:val="000000"/>
           <w:sz w:val="28"/>
         </w:rPr>
@@ -1327,32 +2079,58 @@
     </w:p>
     <w:p>
       <w:pPr>
-        <w:spacing w:line="240" w:lineRule="auto" w:before="0" w:after="0"/>
-        <w:ind w:left="0" w:right="0" w:firstLine="709"/>
+        <w:spacing w:after="0" w:line="240" w:lineRule="auto"/>
+        <w:ind w:firstLine="709"/>
         <w:jc w:val="both"/>
-      </w:pPr>
-      <w:r>
-        <w:rPr>
-          <w:rFonts w:ascii="Times New Roman" w:hAnsi="Times New Roman"/>
-          <w:b w:val="0"/>
-          <w:i w:val="0"/>
-          <w:color w:val="000000"/>
-          <w:sz w:val="28"/>
-        </w:rPr>
-        <w:t>32131312412 412 4214но вот и все par updated</w:t>
+        <w:rPr>
+          <w:lang w:val="ru-RU"/>
+        </w:rPr>
+      </w:pPr>
+      <w:r>
+        <w:rPr>
+          <w:rFonts w:ascii="Times New Roman" w:hAnsi="Times New Roman"/>
+          <w:color w:val="000000"/>
+          <w:sz w:val="28"/>
+          <w:lang w:val="ru-RU"/>
+        </w:rPr>
+        <w:t xml:space="preserve">32131312412 412 4214но вот и все </w:t>
+      </w:r>
+      <w:r>
+        <w:rPr>
+          <w:rFonts w:ascii="Times New Roman" w:hAnsi="Times New Roman"/>
+          <w:color w:val="000000"/>
+          <w:sz w:val="28"/>
+        </w:rPr>
+        <w:t>par</w:t>
+      </w:r>
+      <w:r>
+        <w:rPr>
+          <w:rFonts w:ascii="Times New Roman" w:hAnsi="Times New Roman"/>
+          <w:color w:val="000000"/>
+          <w:sz w:val="28"/>
+          <w:lang w:val="ru-RU"/>
+        </w:rPr>
+        <w:t xml:space="preserve"> </w:t>
+      </w:r>
+      <w:r>
+        <w:rPr>
+          <w:rFonts w:ascii="Times New Roman" w:hAnsi="Times New Roman"/>
+          <w:color w:val="000000"/>
+          <w:sz w:val="28"/>
+        </w:rPr>
+        <w:t>updated</w:t>
       </w:r>
     </w:p>
     <w:p>
       <w:pPr>
         <w:pStyle w:val="3"/>
-        <w:spacing w:line="240" w:lineRule="auto" w:before="360" w:after="240"/>
-        <w:ind w:left="0" w:right="0" w:firstLine="709"/>
+        <w:spacing w:before="360" w:after="240" w:line="240" w:lineRule="auto"/>
+        <w:ind w:firstLine="709"/>
       </w:pPr>
       <w:r>
         <w:rPr>
           <w:rFonts w:ascii="Times New Roman" w:hAnsi="Times New Roman"/>
           <w:b/>
-          <w:i w:val="0"/>
           <w:color w:val="000000"/>
           <w:sz w:val="28"/>
         </w:rPr>
@@ -1361,55 +2139,112 @@
     </w:p>
     <w:p>
       <w:pPr>
-        <w:spacing w:line="240" w:lineRule="auto" w:before="280" w:after="0"/>
-        <w:ind w:left="0" w:right="0" w:firstLine="0"/>
         <w:pBdr>
           <w:top w:val="single" w:sz="4" w:space="4" w:color="000000"/>
           <w:left w:val="single" w:sz="4" w:space="4" w:color="000000"/>
           <w:bottom w:val="single" w:sz="4" w:space="4" w:color="000000"/>
           <w:right w:val="single" w:sz="4" w:space="4" w:color="000000"/>
         </w:pBdr>
+        <w:spacing w:before="280" w:after="0" w:line="240" w:lineRule="auto"/>
       </w:pPr>
       <w:r>
         <w:rPr>
           <w:rFonts w:ascii="Courier New" w:hAnsi="Courier New"/>
-          <w:b w:val="0"/>
-          <w:i w:val="0"/>
           <w:color w:val="000000"/>
           <w:sz w:val="24"/>
         </w:rPr>
         <w:t>def move_element_word(self, parent: Element, element: Element, after:Element =None):</w:t>
+      </w:r>
+      <w:r>
+        <w:rPr>
+          <w:rFonts w:ascii="Courier New" w:hAnsi="Courier New"/>
+          <w:color w:val="000000"/>
+          <w:sz w:val="24"/>
+        </w:rPr>
         <w:br/>
         <w:t xml:space="preserve">        if isinstance(element,Header):</w:t>
+      </w:r>
+      <w:r>
+        <w:rPr>
+          <w:rFonts w:ascii="Courier New" w:hAnsi="Courier New"/>
+          <w:color w:val="000000"/>
+          <w:sz w:val="24"/>
+        </w:rPr>
         <w:br/>
         <w:t xml:space="preserve">            self.numberer.adjust_header_levels(parent,element)</w:t>
+      </w:r>
+      <w:r>
+        <w:rPr>
+          <w:rFonts w:ascii="Courier New" w:hAnsi="Courier New"/>
+          <w:color w:val="000000"/>
+          <w:sz w:val="24"/>
+        </w:rPr>
         <w:br/>
         <w:t xml:space="preserve">        self.numberer.move_element(parent,element,after)</w:t>
+      </w:r>
+      <w:r>
+        <w:rPr>
+          <w:rFonts w:ascii="Courier New" w:hAnsi="Courier New"/>
+          <w:color w:val="000000"/>
+          <w:sz w:val="24"/>
+        </w:rPr>
         <w:br/>
         <w:t xml:space="preserve">        if not isinstance(element,Header) and not isinstance(parent,Header):</w:t>
+      </w:r>
+      <w:r>
+        <w:rPr>
+          <w:rFonts w:ascii="Courier New" w:hAnsi="Courier New"/>
+          <w:color w:val="000000"/>
+          <w:sz w:val="24"/>
+        </w:rPr>
         <w:br/>
         <w:t xml:space="preserve">            after=parent</w:t>
+      </w:r>
+      <w:r>
+        <w:rPr>
+          <w:rFonts w:ascii="Courier New" w:hAnsi="Courier New"/>
+          <w:color w:val="000000"/>
+          <w:sz w:val="24"/>
+        </w:rPr>
         <w:br/>
         <w:t xml:space="preserve">        if isinstance(element,Header):</w:t>
+      </w:r>
+      <w:r>
+        <w:rPr>
+          <w:rFonts w:ascii="Courier New" w:hAnsi="Courier New"/>
+          <w:color w:val="000000"/>
+          <w:sz w:val="24"/>
+        </w:rPr>
         <w:br/>
         <w:t xml:space="preserve">            self._sync_move_to_doc(element,parent,after,element,parent)</w:t>
+      </w:r>
+      <w:r>
+        <w:rPr>
+          <w:rFonts w:ascii="Courier New" w:hAnsi="Courier New"/>
+          <w:color w:val="000000"/>
+          <w:sz w:val="24"/>
+        </w:rPr>
         <w:br/>
         <w:t xml:space="preserve">        else:</w:t>
+      </w:r>
+      <w:r>
+        <w:rPr>
+          <w:rFonts w:ascii="Courier New" w:hAnsi="Courier New"/>
+          <w:color w:val="000000"/>
+          <w:sz w:val="24"/>
+        </w:rPr>
         <w:br/>
         <w:t xml:space="preserve">            self._sync_move_to_doc(element,parent,after,None,None)</w:t>
       </w:r>
     </w:p>
     <w:p>
       <w:pPr>
-        <w:spacing w:line="240" w:lineRule="auto" w:before="120" w:after="280"/>
-        <w:ind w:left="0" w:right="0" w:firstLine="0"/>
+        <w:spacing w:before="120" w:after="280" w:line="240" w:lineRule="auto"/>
         <w:jc w:val="center"/>
       </w:pPr>
       <w:r>
         <w:rPr>
           <w:rFonts w:ascii="Times New Roman" w:hAnsi="Times New Roman"/>
-          <w:b w:val="0"/>
-          <w:i w:val="0"/>
           <w:color w:val="000000"/>
           <w:sz w:val="28"/>
         </w:rPr>
@@ -1418,15 +2253,13 @@
     </w:p>
     <w:p>
       <w:pPr>
-        <w:spacing w:line="240" w:lineRule="auto" w:before="0" w:after="0"/>
-        <w:ind w:left="0" w:right="0" w:firstLine="709"/>
+        <w:spacing w:after="0" w:line="240" w:lineRule="auto"/>
+        <w:ind w:firstLine="709"/>
         <w:jc w:val="both"/>
       </w:pPr>
       <w:r>
         <w:rPr>
           <w:rFonts w:ascii="Times New Roman" w:hAnsi="Times New Roman"/>
-          <w:b w:val="0"/>
-          <w:i w:val="0"/>
           <w:color w:val="000000"/>
           <w:sz w:val="28"/>
         </w:rPr>
@@ -1435,15 +2268,13 @@
     </w:p>
     <w:p>
       <w:pPr>
-        <w:spacing w:line="240" w:lineRule="auto" w:before="0" w:after="0"/>
-        <w:ind w:left="0" w:right="0" w:firstLine="709"/>
+        <w:spacing w:after="0" w:line="240" w:lineRule="auto"/>
+        <w:ind w:firstLine="709"/>
         <w:jc w:val="both"/>
       </w:pPr>
       <w:r>
         <w:rPr>
           <w:rFonts w:ascii="Times New Roman" w:hAnsi="Times New Roman"/>
-          <w:b w:val="0"/>
-          <w:i w:val="0"/>
           <w:color w:val="000000"/>
           <w:sz w:val="28"/>
         </w:rPr>
@@ -1453,14 +2284,13 @@
     <w:p>
       <w:pPr>
         <w:pStyle w:val="3"/>
-        <w:spacing w:line="240" w:lineRule="auto" w:before="360" w:after="240"/>
-        <w:ind w:left="0" w:right="0" w:firstLine="709"/>
+        <w:spacing w:before="360" w:after="240" w:line="240" w:lineRule="auto"/>
+        <w:ind w:firstLine="709"/>
       </w:pPr>
       <w:r>
         <w:rPr>
           <w:rFonts w:ascii="Times New Roman" w:hAnsi="Times New Roman"/>
           <w:b/>
-          <w:i w:val="0"/>
           <w:color w:val="000000"/>
           <w:sz w:val="28"/>
         </w:rPr>
@@ -1469,15 +2299,13 @@
     </w:p>
     <w:p>
       <w:pPr>
-        <w:spacing w:line="240" w:lineRule="auto" w:before="0" w:after="0"/>
-        <w:ind w:left="0" w:right="0" w:firstLine="709"/>
+        <w:spacing w:after="0" w:line="240" w:lineRule="auto"/>
+        <w:ind w:firstLine="709"/>
         <w:jc w:val="both"/>
       </w:pPr>
       <w:r>
         <w:rPr>
           <w:rFonts w:ascii="Times New Roman" w:hAnsi="Times New Roman"/>
-          <w:b w:val="0"/>
-          <w:i w:val="0"/>
           <w:color w:val="000000"/>
           <w:sz w:val="28"/>
         </w:rPr>
@@ -1486,15 +2314,13 @@
     </w:p>
     <w:p>
       <w:pPr>
-        <w:spacing w:line="240" w:lineRule="auto" w:before="0" w:after="0"/>
-        <w:ind w:left="0" w:right="0" w:firstLine="709"/>
+        <w:spacing w:after="0" w:line="240" w:lineRule="auto"/>
+        <w:ind w:firstLine="709"/>
         <w:jc w:val="both"/>
       </w:pPr>
       <w:r>
         <w:rPr>
           <w:rFonts w:ascii="Times New Roman" w:hAnsi="Times New Roman"/>
-          <w:b w:val="0"/>
-          <w:i w:val="0"/>
           <w:color w:val="000000"/>
           <w:sz w:val="28"/>
         </w:rPr>
@@ -1504,14 +2330,13 @@
     <w:p>
       <w:pPr>
         <w:pStyle w:val="2"/>
-        <w:spacing w:line="240" w:lineRule="auto" w:before="360" w:after="240"/>
-        <w:ind w:left="0" w:right="0" w:firstLine="709"/>
+        <w:spacing w:before="360" w:after="240" w:line="240" w:lineRule="auto"/>
+        <w:ind w:firstLine="709"/>
       </w:pPr>
       <w:r>
         <w:rPr>
           <w:rFonts w:ascii="Times New Roman" w:hAnsi="Times New Roman"/>
           <w:b/>
-          <w:i w:val="0"/>
           <w:color w:val="000000"/>
           <w:sz w:val="28"/>
         </w:rPr>
@@ -1520,15 +2345,13 @@
     </w:p>
     <w:p>
       <w:pPr>
-        <w:spacing w:line="240" w:lineRule="auto" w:before="0" w:after="0"/>
-        <w:ind w:left="0" w:right="0" w:firstLine="709"/>
+        <w:spacing w:after="0" w:line="240" w:lineRule="auto"/>
+        <w:ind w:firstLine="709"/>
         <w:jc w:val="both"/>
       </w:pPr>
       <w:r>
         <w:rPr>
           <w:rFonts w:ascii="Times New Roman" w:hAnsi="Times New Roman"/>
-          <w:b w:val="0"/>
-          <w:i w:val="0"/>
           <w:color w:val="000000"/>
           <w:sz w:val="28"/>
         </w:rPr>
@@ -1537,67 +2360,62 @@
     </w:p>
     <w:tbl>
       <w:tblPr>
-        <w:tblW w:type="auto" w:w="0"/>
+        <w:tblW w:w="0" w:type="auto"/>
         <w:tblLayout w:type="fixed"/>
-        <w:tblLook w:firstColumn="1" w:firstRow="1" w:lastColumn="0" w:lastRow="0" w:noHBand="0" w:noVBand="1" w:val="04A0"/>
+        <w:tblLook w:val="04A0" w:firstRow="1" w:lastRow="0" w:firstColumn="1" w:lastColumn="0" w:noHBand="0" w:noVBand="1"/>
       </w:tblPr>
       <w:tblGrid>
-        <w:gridCol w:w="3120"/>
-        <w:gridCol w:w="3120"/>
-        <w:gridCol w:w="3120"/>
+        <w:gridCol w:w="936"/>
+        <w:gridCol w:w="7488"/>
+        <w:gridCol w:w="936"/>
       </w:tblGrid>
       <w:tr>
         <w:tc>
           <w:tcPr>
-            <w:tcW w:type="dxa" w:w="936"/>
+            <w:tcW w:w="936" w:type="dxa"/>
           </w:tcPr>
           <w:p/>
         </w:tc>
         <w:tc>
           <w:tcPr>
-            <w:tcW w:type="dxa" w:w="7488"/>
-            <w:vAlign w:val="center"/>
-          </w:tcPr>
-          <w:p>
-            <w:pPr>
-              <w:spacing w:line="240" w:lineRule="auto" w:before="240" w:after="240"/>
-              <w:ind w:left="0" w:right="0" w:firstLine="0"/>
-              <w:jc w:val="center"/>
+            <w:tcW w:w="7488" w:type="dxa"/>
+            <w:vAlign w:val="center"/>
+          </w:tcPr>
+          <w:p>
+            <w:pPr>
+              <w:spacing w:before="240" w:after="240" w:line="240" w:lineRule="auto"/>
+              <w:jc w:val="center"/>
+            </w:pPr>
+            <m:oMathPara>
+              <m:oMath>
+                <m:r>
+                  <w:rPr>
+                    <w:rFonts w:ascii="Cambria Math" w:hAnsi="Cambria Math"/>
+                    <w:color w:val="000000"/>
+                    <w:sz w:val="28"/>
+                  </w:rPr>
+                  <m:t>a-2=2</m:t>
+                </m:r>
+              </m:oMath>
+            </m:oMathPara>
+          </w:p>
+        </w:tc>
+        <w:tc>
+          <w:tcPr>
+            <w:tcW w:w="936" w:type="dxa"/>
+            <w:vAlign w:val="center"/>
+          </w:tcPr>
+          <w:p>
+            <w:pPr>
+              <w:spacing w:before="240" w:after="240" w:line="240" w:lineRule="auto"/>
+              <w:jc w:val="right"/>
             </w:pPr>
             <w:r>
               <w:rPr>
-                <w:b w:val="0"/>
-                <w:i w:val="0"/>
+                <w:rFonts w:ascii="Times New Roman" w:hAnsi="Times New Roman"/>
                 <w:color w:val="000000"/>
                 <w:sz w:val="28"/>
               </w:rPr>
-              <m:oMath xmlns:mml="http://www.w3.org/1998/Math/MathML">
-                <m:r>
-                  <m:t>a−2=2</m:t>
-                </m:r>
-              </m:oMath>
-            </w:r>
-          </w:p>
-        </w:tc>
-        <w:tc>
-          <w:tcPr>
-            <w:tcW w:type="dxa" w:w="936"/>
-            <w:vAlign w:val="center"/>
-          </w:tcPr>
-          <w:p>
-            <w:pPr>
-              <w:spacing w:line="240" w:lineRule="auto" w:before="240" w:after="240"/>
-              <w:ind w:left="0" w:right="0" w:firstLine="0"/>
-              <w:jc w:val="right"/>
-            </w:pPr>
-            <w:r>
-              <w:rPr>
-                <w:rFonts w:ascii="Times New Roman" w:hAnsi="Times New Roman"/>
-                <w:b w:val="0"/>
-                <w:i w:val="0"/>
-                <w:color w:val="000000"/>
-                <w:sz w:val="28"/>
-              </w:rPr>
               <w:t>(1.3)</w:t>
             </w:r>
           </w:p>
@@ -1608,14 +2426,13 @@
       <w:pPr>
         <w:pStyle w:val="1"/>
         <w:pageBreakBefore/>
-        <w:spacing w:line="240" w:lineRule="auto" w:before="0" w:after="360"/>
-        <w:ind w:left="0" w:right="0" w:firstLine="709"/>
+        <w:spacing w:before="0" w:after="360" w:line="240" w:lineRule="auto"/>
+        <w:ind w:firstLine="709"/>
       </w:pPr>
       <w:r>
         <w:rPr>
           <w:rFonts w:ascii="Times New Roman" w:hAnsi="Times New Roman"/>
           <w:b/>
-          <w:i w:val="0"/>
           <w:color w:val="000000"/>
           <w:sz w:val="28"/>
         </w:rPr>
@@ -1624,15 +2441,13 @@
     </w:p>
     <w:p>
       <w:pPr>
-        <w:spacing w:line="240" w:lineRule="auto" w:before="0" w:after="0"/>
-        <w:ind w:left="0" w:right="0" w:firstLine="709"/>
+        <w:spacing w:after="0" w:line="240" w:lineRule="auto"/>
+        <w:ind w:firstLine="709"/>
         <w:jc w:val="both"/>
       </w:pPr>
       <w:r>
         <w:rPr>
           <w:rFonts w:ascii="Times New Roman" w:hAnsi="Times New Roman"/>
-          <w:b w:val="0"/>
-          <w:i w:val="0"/>
           <w:color w:val="000000"/>
           <w:sz w:val="28"/>
         </w:rPr>
@@ -1643,14 +2458,13 @@
       <w:pPr>
         <w:pStyle w:val="1"/>
         <w:pageBreakBefore/>
-        <w:spacing w:line="240" w:lineRule="auto" w:before="0" w:after="360"/>
-        <w:ind w:left="0" w:right="0" w:firstLine="709"/>
+        <w:spacing w:before="0" w:after="360" w:line="240" w:lineRule="auto"/>
+        <w:ind w:firstLine="709"/>
       </w:pPr>
       <w:r>
         <w:rPr>
           <w:rFonts w:ascii="Times New Roman" w:hAnsi="Times New Roman"/>
           <w:b/>
-          <w:i w:val="0"/>
           <w:color w:val="000000"/>
           <w:sz w:val="28"/>
         </w:rPr>
@@ -1659,20 +2473,17 @@
     </w:p>
     <w:p>
       <w:pPr>
-        <w:spacing w:line="240" w:lineRule="auto" w:before="280" w:after="0"/>
-        <w:ind w:left="0" w:right="0" w:firstLine="0"/>
         <w:pBdr>
           <w:top w:val="single" w:sz="4" w:space="4" w:color="000000"/>
           <w:left w:val="single" w:sz="4" w:space="4" w:color="000000"/>
           <w:bottom w:val="single" w:sz="4" w:space="4" w:color="000000"/>
           <w:right w:val="single" w:sz="4" w:space="4" w:color="000000"/>
         </w:pBdr>
+        <w:spacing w:before="280" w:after="0" w:line="240" w:lineRule="auto"/>
       </w:pPr>
       <w:r>
         <w:rPr>
           <w:rFonts w:ascii="Courier New" w:hAnsi="Courier New"/>
-          <w:b w:val="0"/>
-          <w:i w:val="0"/>
           <w:color w:val="000000"/>
           <w:sz w:val="24"/>
         </w:rPr>
@@ -1681,15 +2492,12 @@
     </w:p>
     <w:p>
       <w:pPr>
-        <w:spacing w:line="240" w:lineRule="auto" w:before="120" w:after="280"/>
-        <w:ind w:left="0" w:right="0" w:firstLine="0"/>
+        <w:spacing w:before="120" w:after="280" w:line="240" w:lineRule="auto"/>
         <w:jc w:val="center"/>
       </w:pPr>
       <w:r>
         <w:rPr>
           <w:rFonts w:ascii="Times New Roman" w:hAnsi="Times New Roman"/>
-          <w:b w:val="0"/>
-          <w:i w:val="0"/>
           <w:color w:val="000000"/>
           <w:sz w:val="28"/>
         </w:rPr>
@@ -1698,15 +2506,13 @@
     </w:p>
     <w:p>
       <w:pPr>
-        <w:spacing w:line="240" w:lineRule="auto" w:before="0" w:after="0"/>
-        <w:ind w:left="0" w:right="0" w:firstLine="709"/>
+        <w:spacing w:after="0" w:line="240" w:lineRule="auto"/>
+        <w:ind w:firstLine="709"/>
         <w:jc w:val="both"/>
       </w:pPr>
       <w:r>
         <w:rPr>
           <w:rFonts w:ascii="Times New Roman" w:hAnsi="Times New Roman"/>
-          <w:b w:val="0"/>
-          <w:i w:val="0"/>
           <w:color w:val="000000"/>
           <w:sz w:val="28"/>
         </w:rPr>
@@ -1715,15 +2521,13 @@
     </w:p>
     <w:p>
       <w:pPr>
-        <w:spacing w:line="240" w:lineRule="auto" w:before="0" w:after="0"/>
-        <w:ind w:left="0" w:right="0" w:firstLine="709"/>
+        <w:spacing w:after="0" w:line="240" w:lineRule="auto"/>
+        <w:ind w:firstLine="709"/>
         <w:jc w:val="both"/>
       </w:pPr>
       <w:r>
         <w:rPr>
           <w:rFonts w:ascii="Times New Roman" w:hAnsi="Times New Roman"/>
-          <w:b w:val="0"/>
-          <w:i w:val="0"/>
           <w:color w:val="000000"/>
           <w:sz w:val="28"/>
         </w:rPr>
@@ -1732,15 +2536,13 @@
     </w:p>
     <w:p>
       <w:pPr>
-        <w:spacing w:line="240" w:lineRule="auto" w:before="0" w:after="0"/>
-        <w:ind w:left="0" w:right="0" w:firstLine="709"/>
+        <w:spacing w:after="0" w:line="240" w:lineRule="auto"/>
+        <w:ind w:firstLine="709"/>
         <w:jc w:val="both"/>
       </w:pPr>
       <w:r>
         <w:rPr>
           <w:rFonts w:ascii="Times New Roman" w:hAnsi="Times New Roman"/>
-          <w:b w:val="0"/>
-          <w:i w:val="0"/>
           <w:color w:val="000000"/>
           <w:sz w:val="28"/>
         </w:rPr>
@@ -1749,15 +2551,13 @@
     </w:p>
     <w:p>
       <w:pPr>
-        <w:spacing w:line="240" w:lineRule="auto" w:before="0" w:after="0"/>
-        <w:ind w:left="0" w:right="0" w:firstLine="709"/>
+        <w:spacing w:after="0" w:line="240" w:lineRule="auto"/>
+        <w:ind w:firstLine="709"/>
         <w:jc w:val="both"/>
       </w:pPr>
       <w:r>
         <w:rPr>
           <w:rFonts w:ascii="Times New Roman" w:hAnsi="Times New Roman"/>
-          <w:b w:val="0"/>
-          <w:i w:val="0"/>
           <w:color w:val="000000"/>
           <w:sz w:val="28"/>
         </w:rPr>

</xml_diff>